<commit_message>
add graphical representation of results
</commit_message>
<xml_diff>
--- a/NER_SIR_rad.docx
+++ b/NER_SIR_rad.docx
@@ -9,6 +9,8 @@
           <w:sz w:val="28"/>
         </w:rPr>
       </w:pPr>
+      <w:bookmarkStart w:id="0" w:name="_GoBack"/>
+      <w:bookmarkEnd w:id="0"/>
       <w:r>
         <w:rPr>
           <w:noProof/>
@@ -286,9 +288,9 @@
           <w:lang w:val="sr-Cyrl-RS"/>
         </w:rPr>
       </w:pPr>
-      <w:bookmarkStart w:id="0" w:name="_Toc239978784"/>
-      <w:bookmarkStart w:id="1" w:name="_Toc239979026"/>
-      <w:bookmarkStart w:id="2" w:name="_Toc239979073"/>
+      <w:bookmarkStart w:id="1" w:name="_Toc239978784"/>
+      <w:bookmarkStart w:id="2" w:name="_Toc239979026"/>
+      <w:bookmarkStart w:id="3" w:name="_Toc239979073"/>
       <w:r>
         <w:rPr>
           <w:lang w:val="sr-Cyrl-RS"/>
@@ -385,9 +387,9 @@
         </w:rPr>
         <w:t>језику</w:t>
       </w:r>
-      <w:bookmarkEnd w:id="0"/>
       <w:bookmarkEnd w:id="1"/>
       <w:bookmarkEnd w:id="2"/>
+      <w:bookmarkEnd w:id="3"/>
     </w:p>
     <w:p>
       <w:pPr>
@@ -857,7 +859,7 @@
           <w:lang w:val="sr-Cyrl-RS"/>
         </w:rPr>
       </w:pPr>
-      <w:bookmarkStart w:id="3" w:name="_Toc239979074"/>
+      <w:bookmarkStart w:id="4" w:name="_Toc239979074"/>
       <w:r>
         <w:rPr>
           <w:lang w:val="sr-Cyrl-RS"/>
@@ -865,7 +867,7 @@
         <w:lastRenderedPageBreak/>
         <w:t>Сажетак</w:t>
       </w:r>
-      <w:bookmarkEnd w:id="3"/>
+      <w:bookmarkEnd w:id="4"/>
     </w:p>
     <w:p>
       <w:pPr>
@@ -987,7 +989,7 @@
           <w:lang w:val="sr-Cyrl-RS"/>
         </w:rPr>
       </w:pPr>
-      <w:bookmarkStart w:id="4" w:name="_Toc239979075"/>
+      <w:bookmarkStart w:id="5" w:name="_Toc239979075"/>
       <w:r>
         <w:rPr>
           <w:lang w:val="sr-Cyrl-RS"/>
@@ -995,7 +997,7 @@
         <w:lastRenderedPageBreak/>
         <w:t>Садржај</w:t>
       </w:r>
-      <w:bookmarkEnd w:id="4"/>
+      <w:bookmarkEnd w:id="5"/>
     </w:p>
     <w:p>
       <w:pPr>
@@ -2739,7 +2741,7 @@
                 <w:noProof/>
                 <w:webHidden/>
               </w:rPr>
-              <w:t>11</w:t>
+              <w:t>12</w:t>
             </w:r>
             <w:r>
               <w:rPr>
@@ -2829,7 +2831,7 @@
                 <w:noProof/>
                 <w:webHidden/>
               </w:rPr>
-              <w:t>12</w:t>
+              <w:t>13</w:t>
             </w:r>
             <w:r>
               <w:rPr>
@@ -2919,7 +2921,7 @@
                 <w:noProof/>
                 <w:webHidden/>
               </w:rPr>
-              <w:t>13</w:t>
+              <w:t>14</w:t>
             </w:r>
             <w:r>
               <w:rPr>
@@ -3009,7 +3011,7 @@
                 <w:noProof/>
                 <w:webHidden/>
               </w:rPr>
-              <w:t>14</w:t>
+              <w:t>15</w:t>
             </w:r>
             <w:r>
               <w:rPr>
@@ -3066,14 +3068,14 @@
           <w:numId w:val="3"/>
         </w:numPr>
       </w:pPr>
-      <w:bookmarkStart w:id="5" w:name="_Toc239979076"/>
+      <w:bookmarkStart w:id="6" w:name="_Toc239979076"/>
       <w:r>
         <w:rPr>
           <w:lang w:val="sr-Cyrl-RS"/>
         </w:rPr>
         <w:t>Увод</w:t>
       </w:r>
-      <w:bookmarkEnd w:id="5"/>
+      <w:bookmarkEnd w:id="6"/>
     </w:p>
     <w:p/>
     <w:p>
@@ -3239,7 +3241,7 @@
           <w:numId w:val="3"/>
         </w:numPr>
       </w:pPr>
-      <w:bookmarkStart w:id="6" w:name="_Toc239979077"/>
+      <w:bookmarkStart w:id="7" w:name="_Toc239979077"/>
       <w:r>
         <w:rPr>
           <w:lang w:val="sr-Cyrl-RS"/>
@@ -3247,7 +3249,7 @@
         <w:lastRenderedPageBreak/>
         <w:t>Теоријска основа</w:t>
       </w:r>
-      <w:bookmarkEnd w:id="6"/>
+      <w:bookmarkEnd w:id="7"/>
     </w:p>
     <w:p/>
     <w:p>
@@ -3258,11 +3260,11 @@
           <w:numId w:val="7"/>
         </w:numPr>
       </w:pPr>
-      <w:bookmarkStart w:id="7" w:name="_Toc239979078"/>
+      <w:bookmarkStart w:id="8" w:name="_Toc239979078"/>
       <w:r>
         <w:t>Препознавање именованих ентитета</w:t>
       </w:r>
-      <w:bookmarkEnd w:id="7"/>
+      <w:bookmarkEnd w:id="8"/>
     </w:p>
     <w:p/>
     <w:p>
@@ -3335,7 +3337,7 @@
           <w:numId w:val="7"/>
         </w:numPr>
       </w:pPr>
-      <w:bookmarkStart w:id="8" w:name="_Toc239979079"/>
+      <w:bookmarkStart w:id="9" w:name="_Toc239979079"/>
       <w:r>
         <w:rPr>
           <w:lang w:val="sr-Cyrl-RS"/>
@@ -3345,7 +3347,7 @@
       <w:r>
         <w:t xml:space="preserve"> BERT</w:t>
       </w:r>
-      <w:bookmarkEnd w:id="8"/>
+      <w:bookmarkEnd w:id="9"/>
     </w:p>
     <w:p/>
     <w:p>
@@ -3414,14 +3416,14 @@
           <w:lang w:val="sr-Cyrl-RS"/>
         </w:rPr>
       </w:pPr>
-      <w:bookmarkStart w:id="9" w:name="_Toc239979080"/>
+      <w:bookmarkStart w:id="10" w:name="_Toc239979080"/>
       <w:r>
         <w:rPr>
           <w:lang w:val="sr-Cyrl-RS"/>
         </w:rPr>
         <w:t>Језички модели за српски језик</w:t>
       </w:r>
-      <w:bookmarkEnd w:id="9"/>
+      <w:bookmarkEnd w:id="10"/>
     </w:p>
     <w:p>
       <w:pPr>
@@ -4075,7 +4077,7 @@
           <w:numId w:val="7"/>
         </w:numPr>
       </w:pPr>
-      <w:bookmarkStart w:id="10" w:name="_Toc239979081"/>
+      <w:bookmarkStart w:id="11" w:name="_Toc239979081"/>
       <w:r>
         <w:rPr>
           <w:lang w:val="sr-Cyrl-RS"/>
@@ -4115,7 +4117,7 @@
       <w:r>
         <w:t>"</w:t>
       </w:r>
-      <w:bookmarkEnd w:id="10"/>
+      <w:bookmarkEnd w:id="11"/>
     </w:p>
     <w:p>
       <w:pPr>
@@ -4277,11 +4279,11 @@
           <w:numId w:val="7"/>
         </w:numPr>
       </w:pPr>
-      <w:bookmarkStart w:id="11" w:name="_Toc239979082"/>
+      <w:bookmarkStart w:id="12" w:name="_Toc239979082"/>
       <w:r>
         <w:t>Promptovanje: zero-shot, few-shot i lanac rasuđivanja</w:t>
       </w:r>
-      <w:bookmarkEnd w:id="11"/>
+      <w:bookmarkEnd w:id="12"/>
     </w:p>
     <w:p/>
     <w:p>
@@ -4354,14 +4356,14 @@
           <w:lang w:val="sr-Cyrl-RS"/>
         </w:rPr>
       </w:pPr>
-      <w:bookmarkStart w:id="12" w:name="_Toc239979083"/>
+      <w:bookmarkStart w:id="13" w:name="_Toc239979083"/>
       <w:r>
         <w:rPr>
           <w:lang w:val="sr-Cyrl-RS"/>
         </w:rPr>
         <w:t>Преглед сличних истраживања</w:t>
       </w:r>
-      <w:bookmarkEnd w:id="12"/>
+      <w:bookmarkEnd w:id="13"/>
       <w:r>
         <w:rPr>
           <w:lang w:val="sr-Cyrl-RS"/>
@@ -4505,7 +4507,7 @@
           <w:numId w:val="7"/>
         </w:numPr>
       </w:pPr>
-      <w:bookmarkStart w:id="13" w:name="_Toc239979084"/>
+      <w:bookmarkStart w:id="14" w:name="_Toc239979084"/>
       <w:r>
         <w:rPr>
           <w:lang w:val="sr-Cyrl-RS"/>
@@ -4515,7 +4517,7 @@
       <w:r>
         <w:t xml:space="preserve"> NER</w:t>
       </w:r>
-      <w:bookmarkEnd w:id="13"/>
+      <w:bookmarkEnd w:id="14"/>
     </w:p>
     <w:p>
       <w:pPr>
@@ -4625,6 +4627,24 @@
       <w:r>
         <w:t>.</w:t>
       </w:r>
+    </w:p>
+    <w:p>
+      <w:pPr>
+        <w:pStyle w:val="NormalWeb"/>
+        <w:jc w:val="both"/>
+      </w:pPr>
+    </w:p>
+    <w:p>
+      <w:pPr>
+        <w:pStyle w:val="NormalWeb"/>
+        <w:jc w:val="both"/>
+      </w:pPr>
+    </w:p>
+    <w:p>
+      <w:pPr>
+        <w:pStyle w:val="NormalWeb"/>
+        <w:jc w:val="both"/>
+      </w:pPr>
     </w:p>
     <w:tbl>
       <w:tblPr>
@@ -4676,6 +4696,7 @@
                 <w:bCs/>
                 <w:lang w:val="sr-Cyrl-RS"/>
               </w:rPr>
+              <w:lastRenderedPageBreak/>
               <w:t>Корпус</w:t>
             </w:r>
           </w:p>
@@ -4792,14 +4813,50 @@
             </w:tcMar>
           </w:tcPr>
           <w:p>
-            <w:r>
-              <w:t>novinski</w:t>
+            <w:pPr>
+              <w:rPr>
+                <w:lang w:val="sr-Cyrl-RS"/>
+              </w:rPr>
+            </w:pPr>
+            <w:r>
+              <w:rPr>
+                <w:lang w:val="sr-Cyrl-RS"/>
+              </w:rPr>
+              <w:t>новински</w:t>
             </w:r>
           </w:p>
         </w:tc>
         <w:tc>
           <w:tcPr>
             <w:tcW w:w="2200" w:type="dxa"/>
+            <w:tcMar>
+              <w:top w:w="40" w:type="dxa"/>
+              <w:left w:w="80" w:type="dxa"/>
+              <w:bottom w:w="40" w:type="dxa"/>
+              <w:right w:w="80" w:type="dxa"/>
+            </w:tcMar>
+          </w:tcPr>
+          <w:p>
+            <w:pPr>
+              <w:jc w:val="center"/>
+              <w:rPr>
+                <w:lang w:val="sr-Cyrl-RS"/>
+              </w:rPr>
+            </w:pPr>
+            <w:r>
+              <w:t xml:space="preserve">97.673 </w:t>
+            </w:r>
+            <w:r>
+              <w:rPr>
+                <w:lang w:val="sr-Cyrl-RS"/>
+              </w:rPr>
+              <w:t>токена</w:t>
+            </w:r>
+          </w:p>
+        </w:tc>
+        <w:tc>
+          <w:tcPr>
+            <w:tcW w:w="2000" w:type="dxa"/>
             <w:tcMar>
               <w:top w:w="40" w:type="dxa"/>
               <w:left w:w="80" w:type="dxa"/>
@@ -4812,7 +4869,69 @@
               <w:jc w:val="center"/>
             </w:pPr>
             <w:r>
-              <w:t>97.673 tokena</w:t>
+              <w:t>CC BY-SA 4.0</w:t>
+            </w:r>
+          </w:p>
+        </w:tc>
+      </w:tr>
+      <w:tr>
+        <w:tc>
+          <w:tcPr>
+            <w:tcW w:w="2400" w:type="dxa"/>
+            <w:tcMar>
+              <w:top w:w="40" w:type="dxa"/>
+              <w:left w:w="80" w:type="dxa"/>
+              <w:bottom w:w="40" w:type="dxa"/>
+              <w:right w:w="80" w:type="dxa"/>
+            </w:tcMar>
+          </w:tcPr>
+          <w:p>
+            <w:r>
+              <w:t>ReLDI-sr [13]</w:t>
+            </w:r>
+          </w:p>
+        </w:tc>
+        <w:tc>
+          <w:tcPr>
+            <w:tcW w:w="2000" w:type="dxa"/>
+            <w:tcMar>
+              <w:top w:w="40" w:type="dxa"/>
+              <w:left w:w="80" w:type="dxa"/>
+              <w:bottom w:w="40" w:type="dxa"/>
+              <w:right w:w="80" w:type="dxa"/>
+            </w:tcMar>
+          </w:tcPr>
+          <w:p>
+            <w:r>
+              <w:t>Twitter</w:t>
+            </w:r>
+          </w:p>
+        </w:tc>
+        <w:tc>
+          <w:tcPr>
+            <w:tcW w:w="2200" w:type="dxa"/>
+            <w:tcMar>
+              <w:top w:w="40" w:type="dxa"/>
+              <w:left w:w="80" w:type="dxa"/>
+              <w:bottom w:w="40" w:type="dxa"/>
+              <w:right w:w="80" w:type="dxa"/>
+            </w:tcMar>
+          </w:tcPr>
+          <w:p>
+            <w:pPr>
+              <w:jc w:val="center"/>
+              <w:rPr>
+                <w:lang w:val="sr-Cyrl-RS"/>
+              </w:rPr>
+            </w:pPr>
+            <w:r>
+              <w:t xml:space="preserve">92.271 </w:t>
+            </w:r>
+            <w:r>
+              <w:rPr>
+                <w:lang w:val="sr-Cyrl-RS"/>
+              </w:rPr>
+              <w:t>токена</w:t>
             </w:r>
           </w:p>
         </w:tc>
@@ -4849,7 +4968,7 @@
           </w:tcPr>
           <w:p>
             <w:r>
-              <w:t>ReLDI-sr [13]</w:t>
+              <w:t>hr500k [14]</w:t>
             </w:r>
           </w:p>
         </w:tc>
@@ -4865,13 +4984,56 @@
           </w:tcPr>
           <w:p>
             <w:r>
-              <w:t>Twitter</w:t>
+              <w:rPr>
+                <w:lang w:val="sr-Cyrl-RS"/>
+              </w:rPr>
+              <w:t>мешовити</w:t>
+            </w:r>
+            <w:r>
+              <w:t xml:space="preserve"> (</w:t>
+            </w:r>
+            <w:r>
+              <w:rPr>
+                <w:lang w:val="sr-Cyrl-RS"/>
+              </w:rPr>
+              <w:t>хрв</w:t>
+            </w:r>
+            <w:r>
+              <w:t>.)</w:t>
             </w:r>
           </w:p>
         </w:tc>
         <w:tc>
           <w:tcPr>
             <w:tcW w:w="2200" w:type="dxa"/>
+            <w:tcMar>
+              <w:top w:w="40" w:type="dxa"/>
+              <w:left w:w="80" w:type="dxa"/>
+              <w:bottom w:w="40" w:type="dxa"/>
+              <w:right w:w="80" w:type="dxa"/>
+            </w:tcMar>
+          </w:tcPr>
+          <w:p>
+            <w:pPr>
+              <w:jc w:val="center"/>
+              <w:rPr>
+                <w:lang w:val="sr-Cyrl-RS"/>
+              </w:rPr>
+            </w:pPr>
+            <w:r>
+              <w:t xml:space="preserve">499.635 </w:t>
+            </w:r>
+            <w:r>
+              <w:rPr>
+                <w:lang w:val="sr-Cyrl-RS"/>
+              </w:rPr>
+              <w:t>токена</w:t>
+            </w:r>
+          </w:p>
+        </w:tc>
+        <w:tc>
+          <w:tcPr>
+            <w:tcW w:w="2000" w:type="dxa"/>
             <w:tcMar>
               <w:top w:w="40" w:type="dxa"/>
               <w:left w:w="80" w:type="dxa"/>
@@ -4884,7 +5046,77 @@
               <w:jc w:val="center"/>
             </w:pPr>
             <w:r>
-              <w:t>92.271 token</w:t>
+              <w:t>CC BY-SA 4.0</w:t>
+            </w:r>
+          </w:p>
+        </w:tc>
+      </w:tr>
+      <w:tr>
+        <w:tc>
+          <w:tcPr>
+            <w:tcW w:w="2400" w:type="dxa"/>
+            <w:tcMar>
+              <w:top w:w="40" w:type="dxa"/>
+              <w:left w:w="80" w:type="dxa"/>
+              <w:bottom w:w="40" w:type="dxa"/>
+              <w:right w:w="80" w:type="dxa"/>
+            </w:tcMar>
+          </w:tcPr>
+          <w:p>
+            <w:r>
+              <w:t>SrpELTeC-gold [15]</w:t>
+            </w:r>
+          </w:p>
+        </w:tc>
+        <w:tc>
+          <w:tcPr>
+            <w:tcW w:w="2000" w:type="dxa"/>
+            <w:tcMar>
+              <w:top w:w="40" w:type="dxa"/>
+              <w:left w:w="80" w:type="dxa"/>
+              <w:bottom w:w="40" w:type="dxa"/>
+              <w:right w:w="80" w:type="dxa"/>
+            </w:tcMar>
+          </w:tcPr>
+          <w:p>
+            <w:pPr>
+              <w:rPr>
+                <w:lang w:val="sr-Cyrl-RS"/>
+              </w:rPr>
+            </w:pPr>
+            <w:r>
+              <w:rPr>
+                <w:lang w:val="sr-Cyrl-RS"/>
+              </w:rPr>
+              <w:t>књижевни</w:t>
+            </w:r>
+          </w:p>
+        </w:tc>
+        <w:tc>
+          <w:tcPr>
+            <w:tcW w:w="2200" w:type="dxa"/>
+            <w:tcMar>
+              <w:top w:w="40" w:type="dxa"/>
+              <w:left w:w="80" w:type="dxa"/>
+              <w:bottom w:w="40" w:type="dxa"/>
+              <w:right w:w="80" w:type="dxa"/>
+            </w:tcMar>
+          </w:tcPr>
+          <w:p>
+            <w:pPr>
+              <w:jc w:val="center"/>
+              <w:rPr>
+                <w:lang w:val="sr-Cyrl-RS"/>
+              </w:rPr>
+            </w:pPr>
+            <w:r>
+              <w:t xml:space="preserve">~330.000 </w:t>
+            </w:r>
+            <w:r>
+              <w:rPr>
+                <w:lang w:val="sr-Cyrl-RS"/>
+              </w:rPr>
+              <w:t>токена</w:t>
             </w:r>
           </w:p>
         </w:tc>
@@ -4921,7 +5153,7 @@
           </w:tcPr>
           <w:p>
             <w:r>
-              <w:t>hr500k [14]</w:t>
+              <w:t>WikiANN/PAN-X [16]</w:t>
             </w:r>
           </w:p>
         </w:tc>
@@ -4936,13 +5168,16 @@
             </w:tcMar>
           </w:tcPr>
           <w:p>
-            <w:proofErr w:type="gramStart"/>
-            <w:r>
-              <w:t>mešoviti</w:t>
-            </w:r>
-            <w:proofErr w:type="gramEnd"/>
-            <w:r>
-              <w:t xml:space="preserve"> (hrv.)</w:t>
+            <w:pPr>
+              <w:rPr>
+                <w:lang w:val="sr-Cyrl-RS"/>
+              </w:rPr>
+            </w:pPr>
+            <w:r>
+              <w:rPr>
+                <w:lang w:val="sr-Cyrl-RS"/>
+              </w:rPr>
+              <w:t>Википедија</w:t>
             </w:r>
           </w:p>
         </w:tc>
@@ -4959,9 +5194,18 @@
           <w:p>
             <w:pPr>
               <w:jc w:val="center"/>
+              <w:rPr>
+                <w:lang w:val="sr-Cyrl-RS"/>
+              </w:rPr>
             </w:pPr>
             <w:r>
-              <w:t>499.635 tokena</w:t>
+              <w:t xml:space="preserve">~40.000 </w:t>
+            </w:r>
+            <w:r>
+              <w:rPr>
+                <w:lang w:val="sr-Cyrl-RS"/>
+              </w:rPr>
+              <w:t>примера</w:t>
             </w:r>
           </w:p>
         </w:tc>
@@ -4978,9 +5222,15 @@
           <w:p>
             <w:pPr>
               <w:jc w:val="center"/>
+              <w:rPr>
+                <w:lang w:val="sr-Cyrl-RS"/>
+              </w:rPr>
             </w:pPr>
             <w:r>
-              <w:t>CC BY-SA 4.0</w:t>
+              <w:rPr>
+                <w:lang w:val="sr-Cyrl-RS"/>
+              </w:rPr>
+              <w:t>нејасна</w:t>
             </w:r>
           </w:p>
         </w:tc>
@@ -4998,7 +5248,7 @@
           </w:tcPr>
           <w:p>
             <w:r>
-              <w:t>SrpELTeC-gold [15]</w:t>
+              <w:t>NER4Legal_SRB [6]</w:t>
             </w:r>
           </w:p>
         </w:tc>
@@ -5013,8 +5263,16 @@
             </w:tcMar>
           </w:tcPr>
           <w:p>
-            <w:r>
-              <w:t>književni</w:t>
+            <w:pPr>
+              <w:rPr>
+                <w:lang w:val="sr-Cyrl-RS"/>
+              </w:rPr>
+            </w:pPr>
+            <w:r>
+              <w:rPr>
+                <w:lang w:val="sr-Cyrl-RS"/>
+              </w:rPr>
+              <w:t>правни (пресуде)</w:t>
             </w:r>
           </w:p>
         </w:tc>
@@ -5031,9 +5289,18 @@
           <w:p>
             <w:pPr>
               <w:jc w:val="center"/>
+              <w:rPr>
+                <w:lang w:val="sr-Cyrl-RS"/>
+              </w:rPr>
             </w:pPr>
             <w:r>
-              <w:t>~330.000 tokena</w:t>
+              <w:t xml:space="preserve">2.172 </w:t>
+            </w:r>
+            <w:r>
+              <w:rPr>
+                <w:lang w:val="sr-Cyrl-RS"/>
+              </w:rPr>
+              <w:t>реченице</w:t>
             </w:r>
           </w:p>
         </w:tc>
@@ -5050,154 +5317,15 @@
           <w:p>
             <w:pPr>
               <w:jc w:val="center"/>
+              <w:rPr>
+                <w:lang w:val="sr-Cyrl-RS"/>
+              </w:rPr>
             </w:pPr>
             <w:r>
-              <w:t>CC BY-SA 4.0</w:t>
-            </w:r>
-          </w:p>
-        </w:tc>
-      </w:tr>
-      <w:tr>
-        <w:tc>
-          <w:tcPr>
-            <w:tcW w:w="2400" w:type="dxa"/>
-            <w:tcMar>
-              <w:top w:w="40" w:type="dxa"/>
-              <w:left w:w="80" w:type="dxa"/>
-              <w:bottom w:w="40" w:type="dxa"/>
-              <w:right w:w="80" w:type="dxa"/>
-            </w:tcMar>
-          </w:tcPr>
-          <w:p>
-            <w:r>
-              <w:lastRenderedPageBreak/>
-              <w:t>WikiANN/PAN-X [16]</w:t>
-            </w:r>
-          </w:p>
-        </w:tc>
-        <w:tc>
-          <w:tcPr>
-            <w:tcW w:w="2000" w:type="dxa"/>
-            <w:tcMar>
-              <w:top w:w="40" w:type="dxa"/>
-              <w:left w:w="80" w:type="dxa"/>
-              <w:bottom w:w="40" w:type="dxa"/>
-              <w:right w:w="80" w:type="dxa"/>
-            </w:tcMar>
-          </w:tcPr>
-          <w:p>
-            <w:r>
-              <w:t>Vikipedija</w:t>
-            </w:r>
-          </w:p>
-        </w:tc>
-        <w:tc>
-          <w:tcPr>
-            <w:tcW w:w="2200" w:type="dxa"/>
-            <w:tcMar>
-              <w:top w:w="40" w:type="dxa"/>
-              <w:left w:w="80" w:type="dxa"/>
-              <w:bottom w:w="40" w:type="dxa"/>
-              <w:right w:w="80" w:type="dxa"/>
-            </w:tcMar>
-          </w:tcPr>
-          <w:p>
-            <w:pPr>
-              <w:jc w:val="center"/>
-            </w:pPr>
-            <w:r>
-              <w:t>~40.000 primera</w:t>
-            </w:r>
-          </w:p>
-        </w:tc>
-        <w:tc>
-          <w:tcPr>
-            <w:tcW w:w="2000" w:type="dxa"/>
-            <w:tcMar>
-              <w:top w:w="40" w:type="dxa"/>
-              <w:left w:w="80" w:type="dxa"/>
-              <w:bottom w:w="40" w:type="dxa"/>
-              <w:right w:w="80" w:type="dxa"/>
-            </w:tcMar>
-          </w:tcPr>
-          <w:p>
-            <w:pPr>
-              <w:jc w:val="center"/>
-            </w:pPr>
-            <w:r>
-              <w:t>nejasna</w:t>
-            </w:r>
-          </w:p>
-        </w:tc>
-      </w:tr>
-      <w:tr>
-        <w:tc>
-          <w:tcPr>
-            <w:tcW w:w="2400" w:type="dxa"/>
-            <w:tcMar>
-              <w:top w:w="40" w:type="dxa"/>
-              <w:left w:w="80" w:type="dxa"/>
-              <w:bottom w:w="40" w:type="dxa"/>
-              <w:right w:w="80" w:type="dxa"/>
-            </w:tcMar>
-          </w:tcPr>
-          <w:p>
-            <w:r>
-              <w:t>NER4Legal_SRB [6]</w:t>
-            </w:r>
-          </w:p>
-        </w:tc>
-        <w:tc>
-          <w:tcPr>
-            <w:tcW w:w="2000" w:type="dxa"/>
-            <w:tcMar>
-              <w:top w:w="40" w:type="dxa"/>
-              <w:left w:w="80" w:type="dxa"/>
-              <w:bottom w:w="40" w:type="dxa"/>
-              <w:right w:w="80" w:type="dxa"/>
-            </w:tcMar>
-          </w:tcPr>
-          <w:p>
-            <w:r>
-              <w:t>pravni (presude)</w:t>
-            </w:r>
-          </w:p>
-        </w:tc>
-        <w:tc>
-          <w:tcPr>
-            <w:tcW w:w="2200" w:type="dxa"/>
-            <w:tcMar>
-              <w:top w:w="40" w:type="dxa"/>
-              <w:left w:w="80" w:type="dxa"/>
-              <w:bottom w:w="40" w:type="dxa"/>
-              <w:right w:w="80" w:type="dxa"/>
-            </w:tcMar>
-          </w:tcPr>
-          <w:p>
-            <w:pPr>
-              <w:jc w:val="center"/>
-            </w:pPr>
-            <w:r>
-              <w:t>2.172 rečenice</w:t>
-            </w:r>
-          </w:p>
-        </w:tc>
-        <w:tc>
-          <w:tcPr>
-            <w:tcW w:w="2000" w:type="dxa"/>
-            <w:tcMar>
-              <w:top w:w="40" w:type="dxa"/>
-              <w:left w:w="80" w:type="dxa"/>
-              <w:bottom w:w="40" w:type="dxa"/>
-              <w:right w:w="80" w:type="dxa"/>
-            </w:tcMar>
-          </w:tcPr>
-          <w:p>
-            <w:pPr>
-              <w:jc w:val="center"/>
-            </w:pPr>
-            <w:r>
-              <w:t>samo model</w:t>
+              <w:rPr>
+                <w:lang w:val="sr-Cyrl-RS"/>
+              </w:rPr>
+              <w:t>само модел</w:t>
             </w:r>
           </w:p>
         </w:tc>
@@ -5255,14 +5383,14 @@
           <w:numId w:val="7"/>
         </w:numPr>
       </w:pPr>
-      <w:bookmarkStart w:id="14" w:name="_Toc239979085"/>
+      <w:bookmarkStart w:id="15" w:name="_Toc239979085"/>
       <w:r>
         <w:rPr>
           <w:lang w:val="sr-Cyrl-RS"/>
         </w:rPr>
         <w:t>Методологија</w:t>
       </w:r>
-      <w:bookmarkEnd w:id="14"/>
+      <w:bookmarkEnd w:id="15"/>
     </w:p>
     <w:p/>
     <w:p>
@@ -5276,14 +5404,14 @@
           <w:lang w:val="sr-Cyrl-RS"/>
         </w:rPr>
       </w:pPr>
-      <w:bookmarkStart w:id="15" w:name="_Toc239979086"/>
+      <w:bookmarkStart w:id="16" w:name="_Toc239979086"/>
       <w:r>
         <w:rPr>
           <w:lang w:val="sr-Cyrl-RS"/>
         </w:rPr>
         <w:t>Креиранје скупа података</w:t>
       </w:r>
-      <w:bookmarkEnd w:id="15"/>
+      <w:bookmarkEnd w:id="16"/>
     </w:p>
     <w:p>
       <w:pPr>
@@ -5388,20 +5516,12 @@
         <w:jc w:val="both"/>
       </w:pPr>
       <w:r>
-        <w:t>Будући да је легислатива сиромашна ентитетима — само око 23% реченица садржи иједан ентитет — за евалуацију „мислећих“ модела формиран је гушћи подскуп од 452 реченице, који обухвата све реченице са ређим типовима ентитета (COURT, DATE, MONEY, DECISION, REFERENCE, PERSON) и репрезентативан узорак реченица са честим типовима и празних реченица. Тиме је обезбеђено да се ређи типови вреднују на свим расположивим појавама, а да подскуп истовремено остане статистички упоредив са целим скупом.</w:t>
-      </w:r>
-    </w:p>
-    <w:p>
-      <w:pPr>
-        <w:pStyle w:val="NormalWeb"/>
-        <w:jc w:val="both"/>
-      </w:pPr>
-    </w:p>
-    <w:p>
-      <w:pPr>
-        <w:pStyle w:val="NormalWeb"/>
-        <w:jc w:val="both"/>
-      </w:pPr>
+        <w:t xml:space="preserve">Будући да је легислатива сиромашна ентитетима — само око 23% реченица садржи иједан ентитет — за евалуацију „мислећих“ модела формиран је гушћи подскуп од 452 реченице, који обухвата све реченице са ређим типовима ентитета (COURT, DATE, MONEY, DECISION, REFERENCE, PERSON) и репрезентативан узорак реченица са честим типовима и празних реченица. Тиме је обезбеђено да се ређи типови вреднују на </w:t>
+      </w:r>
+      <w:r>
+        <w:lastRenderedPageBreak/>
+        <w:t>свим расположивим појавама, а да подскуп истовремено остане статистички упоредив са целим скупом.</w:t>
+      </w:r>
     </w:p>
     <w:p>
       <w:pPr>
@@ -5414,9 +5534,8 @@
           <w:lang w:val="sr-Cyrl-RS"/>
         </w:rPr>
       </w:pPr>
-      <w:bookmarkStart w:id="16" w:name="_Toc239979087"/>
-      <w:r>
-        <w:lastRenderedPageBreak/>
+      <w:bookmarkStart w:id="17" w:name="_Toc239979087"/>
+      <w:r>
         <w:t xml:space="preserve">Shema </w:t>
       </w:r>
       <w:r>
@@ -5425,7 +5544,7 @@
         </w:rPr>
         <w:t>анотације</w:t>
       </w:r>
-      <w:bookmarkEnd w:id="16"/>
+      <w:bookmarkEnd w:id="17"/>
     </w:p>
     <w:p>
       <w:pPr>
@@ -5458,6 +5577,7 @@
     <w:tbl>
       <w:tblPr>
         <w:tblW w:w="7000" w:type="dxa"/>
+        <w:jc w:val="center"/>
         <w:tblBorders>
           <w:top w:val="single" w:sz="4" w:space="0" w:color="auto"/>
           <w:left w:val="single" w:sz="4" w:space="0" w:color="auto"/>
@@ -5480,6 +5600,7 @@
       <w:tr>
         <w:trPr>
           <w:tblHeader/>
+          <w:jc w:val="center"/>
         </w:trPr>
         <w:tc>
           <w:tcPr>
@@ -5566,6 +5687,9 @@
         </w:tc>
       </w:tr>
       <w:tr>
+        <w:trPr>
+          <w:jc w:val="center"/>
+        </w:trPr>
         <w:tc>
           <w:tcPr>
             <w:tcW w:w="3000" w:type="dxa"/>
@@ -5622,6 +5746,9 @@
         </w:tc>
       </w:tr>
       <w:tr>
+        <w:trPr>
+          <w:jc w:val="center"/>
+        </w:trPr>
         <w:tc>
           <w:tcPr>
             <w:tcW w:w="3000" w:type="dxa"/>
@@ -5678,6 +5805,9 @@
         </w:tc>
       </w:tr>
       <w:tr>
+        <w:trPr>
+          <w:jc w:val="center"/>
+        </w:trPr>
         <w:tc>
           <w:tcPr>
             <w:tcW w:w="3000" w:type="dxa"/>
@@ -5734,6 +5864,9 @@
         </w:tc>
       </w:tr>
       <w:tr>
+        <w:trPr>
+          <w:jc w:val="center"/>
+        </w:trPr>
         <w:tc>
           <w:tcPr>
             <w:tcW w:w="3000" w:type="dxa"/>
@@ -5790,6 +5923,9 @@
         </w:tc>
       </w:tr>
       <w:tr>
+        <w:trPr>
+          <w:jc w:val="center"/>
+        </w:trPr>
         <w:tc>
           <w:tcPr>
             <w:tcW w:w="3000" w:type="dxa"/>
@@ -5846,6 +5982,9 @@
         </w:tc>
       </w:tr>
       <w:tr>
+        <w:trPr>
+          <w:jc w:val="center"/>
+        </w:trPr>
         <w:tc>
           <w:tcPr>
             <w:tcW w:w="3000" w:type="dxa"/>
@@ -5902,6 +6041,9 @@
         </w:tc>
       </w:tr>
       <w:tr>
+        <w:trPr>
+          <w:jc w:val="center"/>
+        </w:trPr>
         <w:tc>
           <w:tcPr>
             <w:tcW w:w="3000" w:type="dxa"/>
@@ -5958,6 +6100,9 @@
         </w:tc>
       </w:tr>
       <w:tr>
+        <w:trPr>
+          <w:jc w:val="center"/>
+        </w:trPr>
         <w:tc>
           <w:tcPr>
             <w:tcW w:w="3000" w:type="dxa"/>
@@ -6099,14 +6244,14 @@
           <w:lang w:val="sr-Cyrl-RS"/>
         </w:rPr>
       </w:pPr>
-      <w:bookmarkStart w:id="17" w:name="_Toc239979088"/>
+      <w:bookmarkStart w:id="18" w:name="_Toc239979088"/>
       <w:r>
         <w:rPr>
           <w:lang w:val="sr-Cyrl-RS"/>
         </w:rPr>
         <w:t>Одабир модела</w:t>
       </w:r>
-      <w:bookmarkEnd w:id="17"/>
+      <w:bookmarkEnd w:id="18"/>
     </w:p>
     <w:p>
       <w:pPr>
@@ -6150,11 +6295,11 @@
       </w:r>
       <w:proofErr w:type="gramEnd"/>
       <w:r>
-        <w:t xml:space="preserve"> трошила је десетине секунди по реченици због генерисања ланца расуђивања. Ова разлика од приближно два реда величине представља практично ограничење примене „мислећих“ модела на великим корпусима и сама по себи је релевантан налаз, </w:t>
+        <w:t xml:space="preserve"> трошила је десетине секунди по реченици због генерисања ланца расуђивања. </w:t>
       </w:r>
       <w:r>
         <w:lastRenderedPageBreak/>
-        <w:t>сагласан са запажањима из литературе о високим трошковима инференције генеративних модела [8].</w:t>
+        <w:t>Ова разлика од приближно два реда величине представља практично ограничење примене „мислећих“ модела на великим корпусима и сама по себи је релевантан налаз, сагласан са запажањима из литературе о високим трошковима инференције генеративних модела [8].</w:t>
       </w:r>
     </w:p>
     <w:p>
@@ -6168,14 +6313,14 @@
           <w:lang w:val="sr-Cyrl-RS"/>
         </w:rPr>
       </w:pPr>
-      <w:bookmarkStart w:id="18" w:name="_Toc239979089"/>
+      <w:bookmarkStart w:id="19" w:name="_Toc239979089"/>
       <w:r>
         <w:rPr>
           <w:lang w:val="sr-Cyrl-RS"/>
         </w:rPr>
         <w:t>Поставка експеримента</w:t>
       </w:r>
-      <w:bookmarkEnd w:id="18"/>
+      <w:bookmarkEnd w:id="19"/>
     </w:p>
     <w:p>
       <w:pPr>
@@ -6260,14 +6405,14 @@
           <w:lang w:val="sr-Cyrl-RS"/>
         </w:rPr>
       </w:pPr>
-      <w:bookmarkStart w:id="19" w:name="_Toc239979090"/>
+      <w:bookmarkStart w:id="20" w:name="_Toc239979090"/>
       <w:r>
         <w:rPr>
           <w:lang w:val="sr-Cyrl-RS"/>
         </w:rPr>
         <w:t>Евалуциона метрика</w:t>
       </w:r>
-      <w:bookmarkEnd w:id="19"/>
+      <w:bookmarkEnd w:id="20"/>
     </w:p>
     <w:p>
       <w:pPr>
@@ -6286,14 +6431,6 @@
       </w:pPr>
       <w:r>
         <w:t>Прецизност (P) дефинише се као удео тачно препознатих ентитета међу свим ентитетима које је модел предложио, одзив (R) као удео тачно препознатих ентитета међу свим ентитетима у златном стандарду, а F1 мера као њихова хармонијска средина (F1 = 2·P·R / (P + R)). Коришћен је микро-просек, у којем се доприноси свих типова сабирају пре рачунања мере, чиме доминантни типови (LAW и OFFICIAL_GAZETTE) природно више утичу на укупан резултат. Ради избегавања пристрасности при полуаутоматској анотацији, за предобележавање нису коришћени модели који се оцењују, па добијени златни стандард не фаворизује ниједан од испитиваних система.</w:t>
-      </w:r>
-    </w:p>
-    <w:p>
-      <w:pPr>
-        <w:spacing w:after="120" w:line="360" w:lineRule="auto"/>
-      </w:pPr>
-      <w:r>
-        <w:t>.</w:t>
       </w:r>
     </w:p>
     <w:p>
@@ -6307,7 +6444,7 @@
           <w:lang w:val="sr-Cyrl-RS"/>
         </w:rPr>
       </w:pPr>
-      <w:bookmarkStart w:id="20" w:name="_Toc239979091"/>
+      <w:bookmarkStart w:id="21" w:name="_Toc239979091"/>
       <w:r>
         <w:rPr>
           <w:lang w:val="sr-Cyrl-RS"/>
@@ -6315,7 +6452,7 @@
         <w:lastRenderedPageBreak/>
         <w:t>Резултати</w:t>
       </w:r>
-      <w:bookmarkEnd w:id="20"/>
+      <w:bookmarkEnd w:id="21"/>
     </w:p>
     <w:p>
       <w:pPr>
@@ -7002,6 +7139,7 @@
         <w:spacing w:before="120" w:after="60"/>
         <w:jc w:val="center"/>
         <w:rPr>
+          <w:bCs/>
           <w:sz w:val="18"/>
         </w:rPr>
       </w:pPr>
@@ -7065,6 +7203,197 @@
         </w:rPr>
         <w:t>).</w:t>
       </w:r>
+    </w:p>
+    <w:p>
+      <w:pPr>
+        <w:spacing w:before="120" w:after="60"/>
+        <w:jc w:val="center"/>
+        <w:rPr>
+          <w:sz w:val="18"/>
+        </w:rPr>
+      </w:pPr>
+      <w:r>
+        <w:rPr>
+          <w:noProof/>
+          <w:sz w:val="18"/>
+        </w:rPr>
+        <w:drawing>
+          <wp:inline distT="0" distB="0" distL="0" distR="0" wp14:anchorId="155C87FF" wp14:editId="2CCB00D8">
+            <wp:extent cx="5486400" cy="3200400"/>
+            <wp:effectExtent l="0" t="0" r="0" b="0"/>
+            <wp:docPr id="4" name="Chart 4"/>
+            <wp:cNvGraphicFramePr/>
+            <a:graphic xmlns:a="http://schemas.openxmlformats.org/drawingml/2006/main">
+              <a:graphicData uri="http://schemas.openxmlformats.org/drawingml/2006/chart">
+                <c:chart xmlns:c="http://schemas.openxmlformats.org/drawingml/2006/chart" xmlns:r="http://schemas.openxmlformats.org/officeDocument/2006/relationships" r:id="rId12"/>
+              </a:graphicData>
+            </a:graphic>
+          </wp:inline>
+        </w:drawing>
+      </w:r>
+    </w:p>
+    <w:p>
+      <w:pPr>
+        <w:spacing w:before="120" w:after="60"/>
+        <w:jc w:val="center"/>
+        <w:rPr>
+          <w:sz w:val="18"/>
+          <w:lang w:val="sr-Cyrl-RS"/>
+        </w:rPr>
+      </w:pPr>
+      <w:r>
+        <w:rPr>
+          <w:sz w:val="18"/>
+          <w:lang w:val="sr-Cyrl-RS"/>
+        </w:rPr>
+        <w:t xml:space="preserve">Графикон 1: Табеларни приказ </w:t>
+      </w:r>
+      <w:r>
+        <w:rPr>
+          <w:sz w:val="18"/>
+        </w:rPr>
+        <w:t>F1</w:t>
+      </w:r>
+      <w:r>
+        <w:rPr>
+          <w:sz w:val="18"/>
+          <w:lang w:val="sr-Cyrl-RS"/>
+        </w:rPr>
+        <w:t xml:space="preserve"> мера по систему</w:t>
+      </w:r>
+    </w:p>
+    <w:p>
+      <w:pPr>
+        <w:spacing w:before="120" w:after="60"/>
+        <w:jc w:val="center"/>
+        <w:rPr>
+          <w:sz w:val="18"/>
+          <w:lang w:val="sr-Cyrl-RS"/>
+        </w:rPr>
+      </w:pPr>
+    </w:p>
+    <w:p>
+      <w:pPr>
+        <w:spacing w:before="120" w:after="60"/>
+        <w:jc w:val="center"/>
+        <w:rPr>
+          <w:sz w:val="18"/>
+          <w:lang w:val="sr-Cyrl-RS"/>
+        </w:rPr>
+      </w:pPr>
+      <w:r>
+        <w:rPr>
+          <w:noProof/>
+          <w:sz w:val="18"/>
+        </w:rPr>
+        <w:lastRenderedPageBreak/>
+        <w:drawing>
+          <wp:inline distT="0" distB="0" distL="0" distR="0" wp14:anchorId="7347DC96" wp14:editId="25159209">
+            <wp:extent cx="5486400" cy="3200400"/>
+            <wp:effectExtent l="0" t="0" r="0" b="0"/>
+            <wp:docPr id="5" name="Chart 5"/>
+            <wp:cNvGraphicFramePr/>
+            <a:graphic xmlns:a="http://schemas.openxmlformats.org/drawingml/2006/main">
+              <a:graphicData uri="http://schemas.openxmlformats.org/drawingml/2006/chart">
+                <c:chart xmlns:c="http://schemas.openxmlformats.org/drawingml/2006/chart" xmlns:r="http://schemas.openxmlformats.org/officeDocument/2006/relationships" r:id="rId13"/>
+              </a:graphicData>
+            </a:graphic>
+          </wp:inline>
+        </w:drawing>
+      </w:r>
+    </w:p>
+    <w:p>
+      <w:pPr>
+        <w:spacing w:before="120" w:after="60"/>
+        <w:jc w:val="center"/>
+        <w:rPr>
+          <w:sz w:val="18"/>
+          <w:lang w:val="sr-Cyrl-RS"/>
+        </w:rPr>
+      </w:pPr>
+      <w:r>
+        <w:rPr>
+          <w:sz w:val="18"/>
+          <w:lang w:val="sr-Cyrl-RS"/>
+        </w:rPr>
+        <w:t>Графикон</w:t>
+      </w:r>
+      <w:r>
+        <w:rPr>
+          <w:sz w:val="18"/>
+          <w:lang w:val="sr-Cyrl-RS"/>
+        </w:rPr>
+        <w:t xml:space="preserve"> 2: Табеларни приказ прциизности и одзива по систему (строга метрика)</w:t>
+      </w:r>
+    </w:p>
+    <w:p>
+      <w:pPr>
+        <w:spacing w:before="120" w:after="60"/>
+        <w:jc w:val="center"/>
+        <w:rPr>
+          <w:sz w:val="18"/>
+          <w:lang w:val="sr-Cyrl-RS"/>
+        </w:rPr>
+      </w:pPr>
+    </w:p>
+    <w:p>
+      <w:pPr>
+        <w:spacing w:before="120" w:after="60"/>
+        <w:jc w:val="center"/>
+        <w:rPr>
+          <w:sz w:val="18"/>
+          <w:lang w:val="sr-Cyrl-RS"/>
+        </w:rPr>
+      </w:pPr>
+    </w:p>
+    <w:p>
+      <w:pPr>
+        <w:spacing w:before="120" w:after="60"/>
+        <w:jc w:val="center"/>
+        <w:rPr>
+          <w:sz w:val="18"/>
+          <w:lang w:val="sr-Cyrl-RS"/>
+        </w:rPr>
+      </w:pPr>
+    </w:p>
+    <w:p>
+      <w:pPr>
+        <w:spacing w:before="120" w:after="60"/>
+        <w:jc w:val="center"/>
+        <w:rPr>
+          <w:sz w:val="18"/>
+          <w:lang w:val="sr-Cyrl-RS"/>
+        </w:rPr>
+      </w:pPr>
+    </w:p>
+    <w:p>
+      <w:pPr>
+        <w:spacing w:before="120" w:after="60"/>
+        <w:jc w:val="center"/>
+        <w:rPr>
+          <w:sz w:val="18"/>
+          <w:lang w:val="sr-Cyrl-RS"/>
+        </w:rPr>
+      </w:pPr>
+    </w:p>
+    <w:p>
+      <w:pPr>
+        <w:spacing w:before="120" w:after="60"/>
+        <w:jc w:val="center"/>
+        <w:rPr>
+          <w:sz w:val="18"/>
+          <w:lang w:val="sr-Cyrl-RS"/>
+        </w:rPr>
+      </w:pPr>
+    </w:p>
+    <w:p>
+      <w:pPr>
+        <w:spacing w:before="120" w:after="60"/>
+        <w:jc w:val="center"/>
+        <w:rPr>
+          <w:sz w:val="18"/>
+        </w:rPr>
+      </w:pPr>
     </w:p>
     <w:tbl>
       <w:tblPr>
@@ -8153,6 +8482,7 @@
         <w:spacing w:before="200" w:after="60"/>
         <w:jc w:val="center"/>
         <w:rPr>
+          <w:bCs/>
           <w:sz w:val="18"/>
         </w:rPr>
       </w:pPr>
@@ -8201,6 +8531,99 @@
         </w:rPr>
         <w:t>).</w:t>
       </w:r>
+    </w:p>
+    <w:p>
+      <w:pPr>
+        <w:spacing w:before="200" w:after="60"/>
+        <w:jc w:val="center"/>
+        <w:rPr>
+          <w:bCs/>
+          <w:sz w:val="18"/>
+        </w:rPr>
+      </w:pPr>
+    </w:p>
+    <w:p>
+      <w:pPr>
+        <w:spacing w:before="200" w:after="60"/>
+        <w:jc w:val="center"/>
+        <w:rPr>
+          <w:sz w:val="18"/>
+        </w:rPr>
+      </w:pPr>
+      <w:r>
+        <w:rPr>
+          <w:noProof/>
+          <w:sz w:val="18"/>
+        </w:rPr>
+        <w:lastRenderedPageBreak/>
+        <w:drawing>
+          <wp:inline distT="0" distB="0" distL="0" distR="0" wp14:anchorId="2A0269BE" wp14:editId="1F9E5B53">
+            <wp:extent cx="5486400" cy="3200400"/>
+            <wp:effectExtent l="0" t="0" r="0" b="0"/>
+            <wp:docPr id="6" name="Chart 6"/>
+            <wp:cNvGraphicFramePr/>
+            <a:graphic xmlns:a="http://schemas.openxmlformats.org/drawingml/2006/main">
+              <a:graphicData uri="http://schemas.openxmlformats.org/drawingml/2006/chart">
+                <c:chart xmlns:c="http://schemas.openxmlformats.org/drawingml/2006/chart" xmlns:r="http://schemas.openxmlformats.org/officeDocument/2006/relationships" r:id="rId14"/>
+              </a:graphicData>
+            </a:graphic>
+          </wp:inline>
+        </w:drawing>
+      </w:r>
+    </w:p>
+    <w:p>
+      <w:pPr>
+        <w:spacing w:before="200" w:after="60"/>
+        <w:jc w:val="center"/>
+        <w:rPr>
+          <w:sz w:val="18"/>
+          <w:lang w:val="sr-Cyrl-RS"/>
+        </w:rPr>
+      </w:pPr>
+      <w:r>
+        <w:rPr>
+          <w:sz w:val="18"/>
+          <w:lang w:val="sr-Cyrl-RS"/>
+        </w:rPr>
+        <w:t xml:space="preserve">Графикон 3: Табеларни приказ </w:t>
+      </w:r>
+      <w:r>
+        <w:rPr>
+          <w:sz w:val="18"/>
+        </w:rPr>
+        <w:t>F1</w:t>
+      </w:r>
+      <w:r>
+        <w:rPr>
+          <w:sz w:val="18"/>
+          <w:lang w:val="sr-Cyrl-RS"/>
+        </w:rPr>
+        <w:t xml:space="preserve"> мери </w:t>
+      </w:r>
+      <w:r>
+        <w:rPr>
+          <w:sz w:val="18"/>
+          <w:lang w:val="sr-Cyrl-RS"/>
+        </w:rPr>
+        <w:t xml:space="preserve"> по типу ентитета (релаксирана метрика</w:t>
+      </w:r>
+      <w:r>
+        <w:rPr>
+          <w:sz w:val="18"/>
+          <w:lang w:val="sr-Cyrl-RS"/>
+        </w:rPr>
+        <w:t>)</w:t>
+      </w:r>
+    </w:p>
+    <w:p>
+      <w:pPr>
+        <w:spacing w:before="200" w:after="60"/>
+        <w:jc w:val="center"/>
+        <w:rPr>
+          <w:sz w:val="18"/>
+          <w:lang w:val="sr-Cyrl-RS"/>
+        </w:rPr>
+      </w:pPr>
     </w:p>
     <w:tbl>
       <w:tblPr>
@@ -8563,14 +8986,14 @@
           <w:lang w:val="sr-Cyrl-RS"/>
         </w:rPr>
       </w:pPr>
-      <w:bookmarkStart w:id="21" w:name="_Toc239979092"/>
+      <w:bookmarkStart w:id="22" w:name="_Toc239979092"/>
       <w:r>
         <w:rPr>
           <w:lang w:val="sr-Cyrl-RS"/>
         </w:rPr>
         <w:t>Дискусија резултата</w:t>
       </w:r>
-      <w:bookmarkEnd w:id="21"/>
+      <w:bookmarkEnd w:id="22"/>
     </w:p>
     <w:p>
       <w:pPr>
@@ -8632,6 +9055,7 @@
         <w:jc w:val="both"/>
       </w:pPr>
       <w:r>
+        <w:lastRenderedPageBreak/>
         <w:t xml:space="preserve">Други </w:t>
       </w:r>
       <w:r>
@@ -8732,11 +9156,7 @@
         <w:jc w:val="both"/>
       </w:pPr>
       <w:r>
-        <w:t xml:space="preserve">Квалитативна анализа грешака додатно осветљава добијене бројеве. Инструкцијски модели у zero-shot и few-shot режиму склони су претерaном означавању: у одсуству довољно примера, модел неретко додељује ентитете општим појмовима или измишља ознаке ван задате схеме (уочене су, на пример, непостојеће ознаке типа „PARTY“ или „EMPLOYER“ пре пооштравања инструкције). Укључивање експлицитних негативних </w:t>
-      </w:r>
-      <w:r>
-        <w:lastRenderedPageBreak/>
-        <w:t>правила у prompt (шта се не означава) и примера знатно је смањило овакве грешке, али их није у потпуности отклонило.</w:t>
+        <w:t>Квалитативна анализа грешака додатно осветљава добијене бројеве. Инструкцијски модели у zero-shot и few-shot режиму склони су претерaном означавању: у одсуству довољно примера, модел неретко додељује ентитете општим појмовима или измишља ознаке ван задате схеме (уочене су, на пример, непостојеће ознаке типа „PARTY“ или „EMPLOYER“ пре пооштравања инструкције). Укључивање експлицитних негативних правила у prompt (шта се не означава) и примера знатно је смањило овакве грешке, али их није у потпуности отклонило.</w:t>
       </w:r>
     </w:p>
     <w:p>
@@ -8775,14 +9195,14 @@
           <w:lang w:val="sr-Cyrl-RS"/>
         </w:rPr>
       </w:pPr>
-      <w:bookmarkStart w:id="22" w:name="_Toc239979093"/>
+      <w:bookmarkStart w:id="23" w:name="_Toc239979093"/>
       <w:r>
         <w:rPr>
           <w:lang w:val="sr-Cyrl-RS"/>
         </w:rPr>
         <w:t>Ограничења</w:t>
       </w:r>
-      <w:bookmarkEnd w:id="22"/>
+      <w:bookmarkEnd w:id="23"/>
     </w:p>
     <w:p>
       <w:pPr>
@@ -8799,90 +9219,16 @@
       </w:r>
       <w:proofErr w:type="gramEnd"/>
       <w:r>
-        <w:t xml:space="preserve"> евалуирани су на подскупу од 452 реченице због високе рачунарске цене извршавања, иако тај подскуп обухвата све појаве ретких типова и стога верно одражава њихов учинак на тим типовима. Треће, анотацију је извршио један анотатор, па није мерена сагласност међу анотаторима. Коначно, резултати се односе на конкретну фамилију модела и конкретну формулацију prompta; другачији prompt или друге фамилије модела могли би дати другачије вредности.</w:t>
+        <w:t xml:space="preserve"> евалуирани су на подскупу од 452 реченице због високе рачунарске цене извршавања, иако тај подскуп обухвата све појаве ретких типова и стога верно одражава њихов учинак на тим типовима. Треће, анотацију је извршио један анотатор, па није мерена сагласност међу анотаторима. Коначно, резултати се </w:t>
+      </w:r>
+      <w:r>
+        <w:lastRenderedPageBreak/>
+        <w:t>односе на конкретну фамилију модела и конкретну формулацију prompta; другачији prompt или друге фамилије модела могли би дати другачије вредности.</w:t>
       </w:r>
     </w:p>
     <w:p>
       <w:pPr>
         <w:pStyle w:val="NormalWeb"/>
-        <w:ind w:firstLine="390"/>
-        <w:jc w:val="both"/>
-      </w:pPr>
-    </w:p>
-    <w:p>
-      <w:pPr>
-        <w:pStyle w:val="NormalWeb"/>
-        <w:ind w:firstLine="390"/>
-        <w:jc w:val="both"/>
-      </w:pPr>
-    </w:p>
-    <w:p>
-      <w:pPr>
-        <w:pStyle w:val="NormalWeb"/>
-        <w:ind w:firstLine="390"/>
-        <w:jc w:val="both"/>
-      </w:pPr>
-    </w:p>
-    <w:p>
-      <w:pPr>
-        <w:pStyle w:val="NormalWeb"/>
-        <w:ind w:firstLine="390"/>
-        <w:jc w:val="both"/>
-      </w:pPr>
-    </w:p>
-    <w:p>
-      <w:pPr>
-        <w:pStyle w:val="NormalWeb"/>
-        <w:ind w:firstLine="390"/>
-        <w:jc w:val="both"/>
-      </w:pPr>
-    </w:p>
-    <w:p>
-      <w:pPr>
-        <w:pStyle w:val="NormalWeb"/>
-        <w:ind w:firstLine="390"/>
-        <w:jc w:val="both"/>
-      </w:pPr>
-    </w:p>
-    <w:p>
-      <w:pPr>
-        <w:pStyle w:val="NormalWeb"/>
-        <w:ind w:firstLine="390"/>
-        <w:jc w:val="both"/>
-      </w:pPr>
-    </w:p>
-    <w:p>
-      <w:pPr>
-        <w:pStyle w:val="NormalWeb"/>
-        <w:ind w:firstLine="390"/>
-        <w:jc w:val="both"/>
-      </w:pPr>
-    </w:p>
-    <w:p>
-      <w:pPr>
-        <w:pStyle w:val="NormalWeb"/>
-        <w:ind w:firstLine="390"/>
-        <w:jc w:val="both"/>
-      </w:pPr>
-    </w:p>
-    <w:p>
-      <w:pPr>
-        <w:pStyle w:val="NormalWeb"/>
-        <w:ind w:firstLine="390"/>
-        <w:jc w:val="both"/>
-      </w:pPr>
-    </w:p>
-    <w:p>
-      <w:pPr>
-        <w:pStyle w:val="NormalWeb"/>
-        <w:ind w:firstLine="390"/>
-        <w:jc w:val="both"/>
-      </w:pPr>
-    </w:p>
-    <w:p>
-      <w:pPr>
-        <w:pStyle w:val="NormalWeb"/>
-        <w:ind w:firstLine="390"/>
         <w:jc w:val="both"/>
       </w:pPr>
     </w:p>
@@ -8904,15 +9250,14 @@
           <w:lang w:val="sr-Cyrl-RS"/>
         </w:rPr>
       </w:pPr>
-      <w:bookmarkStart w:id="23" w:name="_Toc239979094"/>
+      <w:bookmarkStart w:id="24" w:name="_Toc239979094"/>
       <w:r>
         <w:rPr>
           <w:lang w:val="sr-Cyrl-RS"/>
         </w:rPr>
-        <w:lastRenderedPageBreak/>
         <w:t>Закључак</w:t>
       </w:r>
-      <w:bookmarkEnd w:id="23"/>
+      <w:bookmarkEnd w:id="24"/>
     </w:p>
     <w:p>
       <w:pPr>
@@ -8966,9 +9311,7 @@
           <w:lang w:val="sr-Cyrl-RS"/>
         </w:rPr>
       </w:pPr>
-      <w:bookmarkStart w:id="24" w:name="_Toc239979095"/>
-      <w:bookmarkStart w:id="25" w:name="_GoBack"/>
-      <w:bookmarkEnd w:id="25"/>
+      <w:bookmarkStart w:id="25" w:name="_Toc239979095"/>
       <w:r>
         <w:rPr>
           <w:lang w:val="sr-Cyrl-RS"/>
@@ -8976,7 +9319,7 @@
         <w:lastRenderedPageBreak/>
         <w:t>Литература</w:t>
       </w:r>
-      <w:bookmarkEnd w:id="24"/>
+      <w:bookmarkEnd w:id="25"/>
     </w:p>
     <w:p>
       <w:pPr>
@@ -9309,7 +9652,7 @@
       <w:r>
         <w:t xml:space="preserve">Pravno-informacioni sistem Republike Srbije, </w:t>
       </w:r>
-      <w:hyperlink r:id="rId12" w:history="1">
+      <w:hyperlink r:id="rId15" w:history="1">
         <w:r>
           <w:rPr>
             <w:rStyle w:val="Hyperlink"/>
@@ -9334,7 +9677,7 @@
       <w:r>
         <w:t xml:space="preserve"> </w:t>
       </w:r>
-      <w:hyperlink r:id="rId13" w:history="1">
+      <w:hyperlink r:id="rId16" w:history="1">
         <w:r>
           <w:rPr>
             <w:rStyle w:val="Hyperlink"/>
@@ -9362,7 +9705,7 @@
       </w:r>
     </w:p>
     <w:sectPr>
-      <w:footerReference w:type="default" r:id="rId14"/>
+      <w:footerReference w:type="default" r:id="rId17"/>
       <w:pgSz w:w="11906" w:h="16838"/>
       <w:pgMar w:top="1440" w:right="1440" w:bottom="1440" w:left="1440" w:header="708" w:footer="708" w:gutter="0"/>
       <w:pgNumType w:start="1"/>
@@ -9445,7 +9788,7 @@
           <w:rPr>
             <w:noProof/>
           </w:rPr>
-          <w:t>13</w:t>
+          <w:t>16</w:t>
         </w:r>
         <w:r>
           <w:rPr>
@@ -11234,6 +11577,3251 @@
 </w:styles>
 </file>
 
+<file path=word/charts/chart1.xml><?xml version="1.0" encoding="utf-8"?>
+<c:chartSpace xmlns:c="http://schemas.openxmlformats.org/drawingml/2006/chart" xmlns:a="http://schemas.openxmlformats.org/drawingml/2006/main" xmlns:r="http://schemas.openxmlformats.org/officeDocument/2006/relationships" xmlns:c16r2="http://schemas.microsoft.com/office/drawing/2015/06/chart">
+  <c:date1904 val="0"/>
+  <c:lang val="en-US"/>
+  <c:roundedCorners val="0"/>
+  <mc:AlternateContent xmlns:mc="http://schemas.openxmlformats.org/markup-compatibility/2006">
+    <mc:Choice xmlns:c14="http://schemas.microsoft.com/office/drawing/2007/8/2/chart" Requires="c14">
+      <c14:style val="102"/>
+    </mc:Choice>
+    <mc:Fallback>
+      <c:style val="2"/>
+    </mc:Fallback>
+  </mc:AlternateContent>
+  <c:chart>
+    <c:title>
+      <c:tx>
+        <c:rich>
+          <a:bodyPr rot="0" spcFirstLastPara="1" vertOverflow="ellipsis" vert="horz" wrap="square" anchor="ctr" anchorCtr="1"/>
+          <a:lstStyle/>
+          <a:p>
+            <a:pPr>
+              <a:defRPr sz="1400" b="0" i="0" u="none" strike="noStrike" kern="1200" spc="0" baseline="0">
+                <a:solidFill>
+                  <a:schemeClr val="tx1">
+                    <a:lumMod val="65000"/>
+                    <a:lumOff val="35000"/>
+                  </a:schemeClr>
+                </a:solidFill>
+                <a:latin typeface="+mn-lt"/>
+                <a:ea typeface="+mn-ea"/>
+                <a:cs typeface="+mn-cs"/>
+              </a:defRPr>
+            </a:pPr>
+            <a:r>
+              <a:rPr lang="sr-Cyrl-RS"/>
+              <a:t>Укупна </a:t>
+            </a:r>
+            <a:r>
+              <a:rPr lang="en-US"/>
+              <a:t>F1</a:t>
+            </a:r>
+            <a:r>
+              <a:rPr lang="sr-Cyrl-RS"/>
+              <a:t> мера по систему (подскуп од 452 реченице)</a:t>
+            </a:r>
+          </a:p>
+        </c:rich>
+      </c:tx>
+      <c:overlay val="0"/>
+      <c:spPr>
+        <a:noFill/>
+        <a:ln>
+          <a:noFill/>
+        </a:ln>
+        <a:effectLst/>
+      </c:spPr>
+      <c:txPr>
+        <a:bodyPr rot="0" spcFirstLastPara="1" vertOverflow="ellipsis" vert="horz" wrap="square" anchor="ctr" anchorCtr="1"/>
+        <a:lstStyle/>
+        <a:p>
+          <a:pPr>
+            <a:defRPr sz="1400" b="0" i="0" u="none" strike="noStrike" kern="1200" spc="0" baseline="0">
+              <a:solidFill>
+                <a:schemeClr val="tx1">
+                  <a:lumMod val="65000"/>
+                  <a:lumOff val="35000"/>
+                </a:schemeClr>
+              </a:solidFill>
+              <a:latin typeface="+mn-lt"/>
+              <a:ea typeface="+mn-ea"/>
+              <a:cs typeface="+mn-cs"/>
+            </a:defRPr>
+          </a:pPr>
+          <a:endParaRPr lang="en-US"/>
+        </a:p>
+      </c:txPr>
+    </c:title>
+    <c:autoTitleDeleted val="0"/>
+    <c:plotArea>
+      <c:layout/>
+      <c:barChart>
+        <c:barDir val="col"/>
+        <c:grouping val="clustered"/>
+        <c:varyColors val="0"/>
+        <c:ser>
+          <c:idx val="0"/>
+          <c:order val="0"/>
+          <c:tx>
+            <c:strRef>
+              <c:f>Sheet1!$B$1</c:f>
+              <c:strCache>
+                <c:ptCount val="1"/>
+                <c:pt idx="0">
+                  <c:v>F1 (строго)</c:v>
+                </c:pt>
+              </c:strCache>
+            </c:strRef>
+          </c:tx>
+          <c:spPr>
+            <a:solidFill>
+              <a:schemeClr val="accent1"/>
+            </a:solidFill>
+            <a:ln>
+              <a:noFill/>
+            </a:ln>
+            <a:effectLst/>
+          </c:spPr>
+          <c:invertIfNegative val="0"/>
+          <c:cat>
+            <c:strRef>
+              <c:f>Sheet1!$A$2:$A$6</c:f>
+              <c:strCache>
+                <c:ptCount val="5"/>
+                <c:pt idx="0">
+                  <c:v>Qwen3-4B инстреукцијски</c:v>
+                </c:pt>
+                <c:pt idx="1">
+                  <c:v>Qwen3-4B мислећи</c:v>
+                </c:pt>
+                <c:pt idx="2">
+                  <c:v>Qwen3-30B инстреукцијски</c:v>
+                </c:pt>
+                <c:pt idx="3">
+                  <c:v>Qwen3-30B мислећи</c:v>
+                </c:pt>
+                <c:pt idx="4">
+                  <c:v>NER4Legal</c:v>
+                </c:pt>
+              </c:strCache>
+            </c:strRef>
+          </c:cat>
+          <c:val>
+            <c:numRef>
+              <c:f>Sheet1!$B$2:$B$6</c:f>
+              <c:numCache>
+                <c:formatCode>General</c:formatCode>
+                <c:ptCount val="5"/>
+                <c:pt idx="0">
+                  <c:v>0.255</c:v>
+                </c:pt>
+                <c:pt idx="1">
+                  <c:v>0.27100000000000002</c:v>
+                </c:pt>
+                <c:pt idx="2">
+                  <c:v>0.249</c:v>
+                </c:pt>
+                <c:pt idx="3">
+                  <c:v>0.32800000000000001</c:v>
+                </c:pt>
+                <c:pt idx="4">
+                  <c:v>6.4000000000000001E-2</c:v>
+                </c:pt>
+              </c:numCache>
+            </c:numRef>
+          </c:val>
+          <c:extLst>
+            <c:ext xmlns:c16="http://schemas.microsoft.com/office/drawing/2014/chart" uri="{C3380CC4-5D6E-409C-BE32-E72D297353CC}">
+              <c16:uniqueId val="{00000000-77E2-4143-A6DE-AB569771AB61}"/>
+            </c:ext>
+          </c:extLst>
+        </c:ser>
+        <c:ser>
+          <c:idx val="1"/>
+          <c:order val="1"/>
+          <c:tx>
+            <c:strRef>
+              <c:f>Sheet1!$C$1</c:f>
+              <c:strCache>
+                <c:ptCount val="1"/>
+                <c:pt idx="0">
+                  <c:v>F1 (релаксирано)</c:v>
+                </c:pt>
+              </c:strCache>
+            </c:strRef>
+          </c:tx>
+          <c:spPr>
+            <a:solidFill>
+              <a:schemeClr val="accent2"/>
+            </a:solidFill>
+            <a:ln>
+              <a:noFill/>
+            </a:ln>
+            <a:effectLst/>
+          </c:spPr>
+          <c:invertIfNegative val="0"/>
+          <c:cat>
+            <c:strRef>
+              <c:f>Sheet1!$A$2:$A$6</c:f>
+              <c:strCache>
+                <c:ptCount val="5"/>
+                <c:pt idx="0">
+                  <c:v>Qwen3-4B инстреукцијски</c:v>
+                </c:pt>
+                <c:pt idx="1">
+                  <c:v>Qwen3-4B мислећи</c:v>
+                </c:pt>
+                <c:pt idx="2">
+                  <c:v>Qwen3-30B инстреукцијски</c:v>
+                </c:pt>
+                <c:pt idx="3">
+                  <c:v>Qwen3-30B мислећи</c:v>
+                </c:pt>
+                <c:pt idx="4">
+                  <c:v>NER4Legal</c:v>
+                </c:pt>
+              </c:strCache>
+            </c:strRef>
+          </c:cat>
+          <c:val>
+            <c:numRef>
+              <c:f>Sheet1!$C$2:$C$6</c:f>
+              <c:numCache>
+                <c:formatCode>General</c:formatCode>
+                <c:ptCount val="5"/>
+                <c:pt idx="0">
+                  <c:v>0.29499999999999998</c:v>
+                </c:pt>
+                <c:pt idx="1">
+                  <c:v>0.28699999999999998</c:v>
+                </c:pt>
+                <c:pt idx="2">
+                  <c:v>0.33300000000000002</c:v>
+                </c:pt>
+                <c:pt idx="3">
+                  <c:v>0.35299999999999998</c:v>
+                </c:pt>
+                <c:pt idx="4">
+                  <c:v>0.36399999999999999</c:v>
+                </c:pt>
+              </c:numCache>
+            </c:numRef>
+          </c:val>
+          <c:extLst>
+            <c:ext xmlns:c16="http://schemas.microsoft.com/office/drawing/2014/chart" uri="{C3380CC4-5D6E-409C-BE32-E72D297353CC}">
+              <c16:uniqueId val="{00000001-77E2-4143-A6DE-AB569771AB61}"/>
+            </c:ext>
+          </c:extLst>
+        </c:ser>
+        <c:dLbls>
+          <c:showLegendKey val="0"/>
+          <c:showVal val="0"/>
+          <c:showCatName val="0"/>
+          <c:showSerName val="0"/>
+          <c:showPercent val="0"/>
+          <c:showBubbleSize val="0"/>
+        </c:dLbls>
+        <c:gapWidth val="219"/>
+        <c:overlap val="-27"/>
+        <c:axId val="681728383"/>
+        <c:axId val="681728799"/>
+      </c:barChart>
+      <c:catAx>
+        <c:axId val="681728383"/>
+        <c:scaling>
+          <c:orientation val="minMax"/>
+        </c:scaling>
+        <c:delete val="0"/>
+        <c:axPos val="b"/>
+        <c:numFmt formatCode="General" sourceLinked="1"/>
+        <c:majorTickMark val="none"/>
+        <c:minorTickMark val="none"/>
+        <c:tickLblPos val="nextTo"/>
+        <c:spPr>
+          <a:noFill/>
+          <a:ln w="9525" cap="flat" cmpd="sng" algn="ctr">
+            <a:solidFill>
+              <a:schemeClr val="tx1">
+                <a:lumMod val="15000"/>
+                <a:lumOff val="85000"/>
+              </a:schemeClr>
+            </a:solidFill>
+            <a:round/>
+          </a:ln>
+          <a:effectLst/>
+        </c:spPr>
+        <c:txPr>
+          <a:bodyPr rot="-60000000" spcFirstLastPara="1" vertOverflow="ellipsis" vert="horz" wrap="square" anchor="ctr" anchorCtr="1"/>
+          <a:lstStyle/>
+          <a:p>
+            <a:pPr>
+              <a:defRPr sz="900" b="0" i="0" u="none" strike="noStrike" kern="1200" baseline="0">
+                <a:solidFill>
+                  <a:schemeClr val="tx1">
+                    <a:lumMod val="65000"/>
+                    <a:lumOff val="35000"/>
+                  </a:schemeClr>
+                </a:solidFill>
+                <a:latin typeface="+mn-lt"/>
+                <a:ea typeface="+mn-ea"/>
+                <a:cs typeface="+mn-cs"/>
+              </a:defRPr>
+            </a:pPr>
+            <a:endParaRPr lang="en-US"/>
+          </a:p>
+        </c:txPr>
+        <c:crossAx val="681728799"/>
+        <c:crosses val="autoZero"/>
+        <c:auto val="1"/>
+        <c:lblAlgn val="ctr"/>
+        <c:lblOffset val="100"/>
+        <c:noMultiLvlLbl val="0"/>
+      </c:catAx>
+      <c:valAx>
+        <c:axId val="681728799"/>
+        <c:scaling>
+          <c:orientation val="minMax"/>
+        </c:scaling>
+        <c:delete val="0"/>
+        <c:axPos val="l"/>
+        <c:majorGridlines>
+          <c:spPr>
+            <a:ln w="9525" cap="flat" cmpd="sng" algn="ctr">
+              <a:solidFill>
+                <a:schemeClr val="tx1">
+                  <a:lumMod val="15000"/>
+                  <a:lumOff val="85000"/>
+                </a:schemeClr>
+              </a:solidFill>
+              <a:round/>
+            </a:ln>
+            <a:effectLst/>
+          </c:spPr>
+        </c:majorGridlines>
+        <c:numFmt formatCode="General" sourceLinked="1"/>
+        <c:majorTickMark val="none"/>
+        <c:minorTickMark val="none"/>
+        <c:tickLblPos val="nextTo"/>
+        <c:spPr>
+          <a:noFill/>
+          <a:ln>
+            <a:noFill/>
+          </a:ln>
+          <a:effectLst/>
+        </c:spPr>
+        <c:txPr>
+          <a:bodyPr rot="-60000000" spcFirstLastPara="1" vertOverflow="ellipsis" vert="horz" wrap="square" anchor="ctr" anchorCtr="1"/>
+          <a:lstStyle/>
+          <a:p>
+            <a:pPr>
+              <a:defRPr sz="900" b="0" i="0" u="none" strike="noStrike" kern="1200" baseline="0">
+                <a:solidFill>
+                  <a:schemeClr val="tx1">
+                    <a:lumMod val="65000"/>
+                    <a:lumOff val="35000"/>
+                  </a:schemeClr>
+                </a:solidFill>
+                <a:latin typeface="+mn-lt"/>
+                <a:ea typeface="+mn-ea"/>
+                <a:cs typeface="+mn-cs"/>
+              </a:defRPr>
+            </a:pPr>
+            <a:endParaRPr lang="en-US"/>
+          </a:p>
+        </c:txPr>
+        <c:crossAx val="681728383"/>
+        <c:crosses val="autoZero"/>
+        <c:crossBetween val="between"/>
+      </c:valAx>
+      <c:spPr>
+        <a:noFill/>
+        <a:ln>
+          <a:noFill/>
+        </a:ln>
+        <a:effectLst/>
+      </c:spPr>
+    </c:plotArea>
+    <c:legend>
+      <c:legendPos val="b"/>
+      <c:overlay val="0"/>
+      <c:spPr>
+        <a:noFill/>
+        <a:ln>
+          <a:noFill/>
+        </a:ln>
+        <a:effectLst/>
+      </c:spPr>
+      <c:txPr>
+        <a:bodyPr rot="0" spcFirstLastPara="1" vertOverflow="ellipsis" vert="horz" wrap="square" anchor="ctr" anchorCtr="1"/>
+        <a:lstStyle/>
+        <a:p>
+          <a:pPr>
+            <a:defRPr sz="900" b="0" i="0" u="none" strike="noStrike" kern="1200" baseline="0">
+              <a:solidFill>
+                <a:schemeClr val="tx1">
+                  <a:lumMod val="65000"/>
+                  <a:lumOff val="35000"/>
+                </a:schemeClr>
+              </a:solidFill>
+              <a:latin typeface="+mn-lt"/>
+              <a:ea typeface="+mn-ea"/>
+              <a:cs typeface="+mn-cs"/>
+            </a:defRPr>
+          </a:pPr>
+          <a:endParaRPr lang="en-US"/>
+        </a:p>
+      </c:txPr>
+    </c:legend>
+    <c:plotVisOnly val="1"/>
+    <c:dispBlanksAs val="gap"/>
+    <c:showDLblsOverMax val="0"/>
+  </c:chart>
+  <c:spPr>
+    <a:solidFill>
+      <a:schemeClr val="bg1"/>
+    </a:solidFill>
+    <a:ln w="9525" cap="flat" cmpd="sng" algn="ctr">
+      <a:solidFill>
+        <a:schemeClr val="tx1">
+          <a:lumMod val="15000"/>
+          <a:lumOff val="85000"/>
+        </a:schemeClr>
+      </a:solidFill>
+      <a:round/>
+    </a:ln>
+    <a:effectLst/>
+  </c:spPr>
+  <c:txPr>
+    <a:bodyPr/>
+    <a:lstStyle/>
+    <a:p>
+      <a:pPr>
+        <a:defRPr/>
+      </a:pPr>
+      <a:endParaRPr lang="en-US"/>
+    </a:p>
+  </c:txPr>
+  <c:externalData r:id="rId3">
+    <c:autoUpdate val="0"/>
+  </c:externalData>
+</c:chartSpace>
+</file>
+
+<file path=word/charts/chart2.xml><?xml version="1.0" encoding="utf-8"?>
+<c:chartSpace xmlns:c="http://schemas.openxmlformats.org/drawingml/2006/chart" xmlns:a="http://schemas.openxmlformats.org/drawingml/2006/main" xmlns:r="http://schemas.openxmlformats.org/officeDocument/2006/relationships" xmlns:c16r2="http://schemas.microsoft.com/office/drawing/2015/06/chart">
+  <c:date1904 val="0"/>
+  <c:lang val="en-US"/>
+  <c:roundedCorners val="0"/>
+  <mc:AlternateContent xmlns:mc="http://schemas.openxmlformats.org/markup-compatibility/2006">
+    <mc:Choice xmlns:c14="http://schemas.microsoft.com/office/drawing/2007/8/2/chart" Requires="c14">
+      <c14:style val="102"/>
+    </mc:Choice>
+    <mc:Fallback>
+      <c:style val="2"/>
+    </mc:Fallback>
+  </mc:AlternateContent>
+  <c:chart>
+    <c:title>
+      <c:tx>
+        <c:rich>
+          <a:bodyPr rot="0" spcFirstLastPara="1" vertOverflow="ellipsis" vert="horz" wrap="square" anchor="ctr" anchorCtr="1"/>
+          <a:lstStyle/>
+          <a:p>
+            <a:pPr>
+              <a:defRPr sz="1400" b="0" i="0" u="none" strike="noStrike" kern="1200" spc="0" baseline="0">
+                <a:solidFill>
+                  <a:schemeClr val="tx1">
+                    <a:lumMod val="65000"/>
+                    <a:lumOff val="35000"/>
+                  </a:schemeClr>
+                </a:solidFill>
+                <a:latin typeface="+mn-lt"/>
+                <a:ea typeface="+mn-ea"/>
+                <a:cs typeface="+mn-cs"/>
+              </a:defRPr>
+            </a:pPr>
+            <a:r>
+              <a:rPr lang="sr-Cyrl-RS"/>
+              <a:t>Прецизност</a:t>
+            </a:r>
+            <a:r>
+              <a:rPr lang="sr-Cyrl-RS" baseline="0"/>
+              <a:t> и одзив по систему (строга метрика)</a:t>
+            </a:r>
+            <a:endParaRPr lang="en-US"/>
+          </a:p>
+        </c:rich>
+      </c:tx>
+      <c:overlay val="0"/>
+      <c:spPr>
+        <a:noFill/>
+        <a:ln>
+          <a:noFill/>
+        </a:ln>
+        <a:effectLst/>
+      </c:spPr>
+      <c:txPr>
+        <a:bodyPr rot="0" spcFirstLastPara="1" vertOverflow="ellipsis" vert="horz" wrap="square" anchor="ctr" anchorCtr="1"/>
+        <a:lstStyle/>
+        <a:p>
+          <a:pPr>
+            <a:defRPr sz="1400" b="0" i="0" u="none" strike="noStrike" kern="1200" spc="0" baseline="0">
+              <a:solidFill>
+                <a:schemeClr val="tx1">
+                  <a:lumMod val="65000"/>
+                  <a:lumOff val="35000"/>
+                </a:schemeClr>
+              </a:solidFill>
+              <a:latin typeface="+mn-lt"/>
+              <a:ea typeface="+mn-ea"/>
+              <a:cs typeface="+mn-cs"/>
+            </a:defRPr>
+          </a:pPr>
+          <a:endParaRPr lang="en-US"/>
+        </a:p>
+      </c:txPr>
+    </c:title>
+    <c:autoTitleDeleted val="0"/>
+    <c:plotArea>
+      <c:layout/>
+      <c:barChart>
+        <c:barDir val="col"/>
+        <c:grouping val="clustered"/>
+        <c:varyColors val="0"/>
+        <c:ser>
+          <c:idx val="0"/>
+          <c:order val="0"/>
+          <c:tx>
+            <c:strRef>
+              <c:f>Sheet1!$B$1</c:f>
+              <c:strCache>
+                <c:ptCount val="1"/>
+                <c:pt idx="0">
+                  <c:v>Прецизност</c:v>
+                </c:pt>
+              </c:strCache>
+            </c:strRef>
+          </c:tx>
+          <c:spPr>
+            <a:solidFill>
+              <a:schemeClr val="accent1"/>
+            </a:solidFill>
+            <a:ln>
+              <a:noFill/>
+            </a:ln>
+            <a:effectLst/>
+          </c:spPr>
+          <c:invertIfNegative val="0"/>
+          <c:cat>
+            <c:strRef>
+              <c:f>Sheet1!$A$2:$A$6</c:f>
+              <c:strCache>
+                <c:ptCount val="5"/>
+                <c:pt idx="0">
+                  <c:v>Qwen3-4B инструкцијски</c:v>
+                </c:pt>
+                <c:pt idx="1">
+                  <c:v>Qwen3-4B мислећи</c:v>
+                </c:pt>
+                <c:pt idx="2">
+                  <c:v>Qwen3-30B инструкцијски</c:v>
+                </c:pt>
+                <c:pt idx="3">
+                  <c:v>Qwen3-30B мислећи</c:v>
+                </c:pt>
+                <c:pt idx="4">
+                  <c:v>NER4Legal</c:v>
+                </c:pt>
+              </c:strCache>
+            </c:strRef>
+          </c:cat>
+          <c:val>
+            <c:numRef>
+              <c:f>Sheet1!$B$2:$B$6</c:f>
+              <c:numCache>
+                <c:formatCode>General</c:formatCode>
+                <c:ptCount val="5"/>
+                <c:pt idx="0">
+                  <c:v>0.21</c:v>
+                </c:pt>
+                <c:pt idx="1">
+                  <c:v>0.78</c:v>
+                </c:pt>
+                <c:pt idx="2">
+                  <c:v>0.21</c:v>
+                </c:pt>
+                <c:pt idx="3">
+                  <c:v>0.76</c:v>
+                </c:pt>
+                <c:pt idx="4">
+                  <c:v>0.08</c:v>
+                </c:pt>
+              </c:numCache>
+            </c:numRef>
+          </c:val>
+          <c:extLst>
+            <c:ext xmlns:c16="http://schemas.microsoft.com/office/drawing/2014/chart" uri="{C3380CC4-5D6E-409C-BE32-E72D297353CC}">
+              <c16:uniqueId val="{00000000-7AAD-4045-B48B-9911C56A0387}"/>
+            </c:ext>
+          </c:extLst>
+        </c:ser>
+        <c:ser>
+          <c:idx val="1"/>
+          <c:order val="1"/>
+          <c:tx>
+            <c:strRef>
+              <c:f>Sheet1!$C$1</c:f>
+              <c:strCache>
+                <c:ptCount val="1"/>
+                <c:pt idx="0">
+                  <c:v>Одзив</c:v>
+                </c:pt>
+              </c:strCache>
+            </c:strRef>
+          </c:tx>
+          <c:spPr>
+            <a:solidFill>
+              <a:schemeClr val="accent2"/>
+            </a:solidFill>
+            <a:ln>
+              <a:noFill/>
+            </a:ln>
+            <a:effectLst/>
+          </c:spPr>
+          <c:invertIfNegative val="0"/>
+          <c:cat>
+            <c:strRef>
+              <c:f>Sheet1!$A$2:$A$6</c:f>
+              <c:strCache>
+                <c:ptCount val="5"/>
+                <c:pt idx="0">
+                  <c:v>Qwen3-4B инструкцијски</c:v>
+                </c:pt>
+                <c:pt idx="1">
+                  <c:v>Qwen3-4B мислећи</c:v>
+                </c:pt>
+                <c:pt idx="2">
+                  <c:v>Qwen3-30B инструкцијски</c:v>
+                </c:pt>
+                <c:pt idx="3">
+                  <c:v>Qwen3-30B мислећи</c:v>
+                </c:pt>
+                <c:pt idx="4">
+                  <c:v>NER4Legal</c:v>
+                </c:pt>
+              </c:strCache>
+            </c:strRef>
+          </c:cat>
+          <c:val>
+            <c:numRef>
+              <c:f>Sheet1!$C$2:$C$6</c:f>
+              <c:numCache>
+                <c:formatCode>General</c:formatCode>
+                <c:ptCount val="5"/>
+                <c:pt idx="0">
+                  <c:v>0.32</c:v>
+                </c:pt>
+                <c:pt idx="1">
+                  <c:v>0.16</c:v>
+                </c:pt>
+                <c:pt idx="2">
+                  <c:v>0.31</c:v>
+                </c:pt>
+                <c:pt idx="3">
+                  <c:v>0.21</c:v>
+                </c:pt>
+                <c:pt idx="4">
+                  <c:v>0.05</c:v>
+                </c:pt>
+              </c:numCache>
+            </c:numRef>
+          </c:val>
+          <c:extLst>
+            <c:ext xmlns:c16="http://schemas.microsoft.com/office/drawing/2014/chart" uri="{C3380CC4-5D6E-409C-BE32-E72D297353CC}">
+              <c16:uniqueId val="{00000001-7AAD-4045-B48B-9911C56A0387}"/>
+            </c:ext>
+          </c:extLst>
+        </c:ser>
+        <c:dLbls>
+          <c:showLegendKey val="0"/>
+          <c:showVal val="0"/>
+          <c:showCatName val="0"/>
+          <c:showSerName val="0"/>
+          <c:showPercent val="0"/>
+          <c:showBubbleSize val="0"/>
+        </c:dLbls>
+        <c:gapWidth val="219"/>
+        <c:overlap val="-27"/>
+        <c:axId val="29655519"/>
+        <c:axId val="29658847"/>
+      </c:barChart>
+      <c:catAx>
+        <c:axId val="29655519"/>
+        <c:scaling>
+          <c:orientation val="minMax"/>
+        </c:scaling>
+        <c:delete val="0"/>
+        <c:axPos val="b"/>
+        <c:numFmt formatCode="General" sourceLinked="1"/>
+        <c:majorTickMark val="none"/>
+        <c:minorTickMark val="none"/>
+        <c:tickLblPos val="nextTo"/>
+        <c:spPr>
+          <a:noFill/>
+          <a:ln w="9525" cap="flat" cmpd="sng" algn="ctr">
+            <a:solidFill>
+              <a:schemeClr val="tx1">
+                <a:lumMod val="15000"/>
+                <a:lumOff val="85000"/>
+              </a:schemeClr>
+            </a:solidFill>
+            <a:round/>
+          </a:ln>
+          <a:effectLst/>
+        </c:spPr>
+        <c:txPr>
+          <a:bodyPr rot="-60000000" spcFirstLastPara="1" vertOverflow="ellipsis" vert="horz" wrap="square" anchor="ctr" anchorCtr="1"/>
+          <a:lstStyle/>
+          <a:p>
+            <a:pPr>
+              <a:defRPr sz="900" b="0" i="0" u="none" strike="noStrike" kern="1200" baseline="0">
+                <a:solidFill>
+                  <a:schemeClr val="tx1">
+                    <a:lumMod val="65000"/>
+                    <a:lumOff val="35000"/>
+                  </a:schemeClr>
+                </a:solidFill>
+                <a:latin typeface="+mn-lt"/>
+                <a:ea typeface="+mn-ea"/>
+                <a:cs typeface="+mn-cs"/>
+              </a:defRPr>
+            </a:pPr>
+            <a:endParaRPr lang="en-US"/>
+          </a:p>
+        </c:txPr>
+        <c:crossAx val="29658847"/>
+        <c:crosses val="autoZero"/>
+        <c:auto val="1"/>
+        <c:lblAlgn val="ctr"/>
+        <c:lblOffset val="100"/>
+        <c:noMultiLvlLbl val="0"/>
+      </c:catAx>
+      <c:valAx>
+        <c:axId val="29658847"/>
+        <c:scaling>
+          <c:orientation val="minMax"/>
+        </c:scaling>
+        <c:delete val="0"/>
+        <c:axPos val="l"/>
+        <c:majorGridlines>
+          <c:spPr>
+            <a:ln w="9525" cap="flat" cmpd="sng" algn="ctr">
+              <a:solidFill>
+                <a:schemeClr val="tx1">
+                  <a:lumMod val="15000"/>
+                  <a:lumOff val="85000"/>
+                </a:schemeClr>
+              </a:solidFill>
+              <a:round/>
+            </a:ln>
+            <a:effectLst/>
+          </c:spPr>
+        </c:majorGridlines>
+        <c:numFmt formatCode="General" sourceLinked="1"/>
+        <c:majorTickMark val="none"/>
+        <c:minorTickMark val="none"/>
+        <c:tickLblPos val="nextTo"/>
+        <c:spPr>
+          <a:noFill/>
+          <a:ln>
+            <a:noFill/>
+          </a:ln>
+          <a:effectLst/>
+        </c:spPr>
+        <c:txPr>
+          <a:bodyPr rot="-60000000" spcFirstLastPara="1" vertOverflow="ellipsis" vert="horz" wrap="square" anchor="ctr" anchorCtr="1"/>
+          <a:lstStyle/>
+          <a:p>
+            <a:pPr>
+              <a:defRPr sz="900" b="0" i="0" u="none" strike="noStrike" kern="1200" baseline="0">
+                <a:solidFill>
+                  <a:schemeClr val="tx1">
+                    <a:lumMod val="65000"/>
+                    <a:lumOff val="35000"/>
+                  </a:schemeClr>
+                </a:solidFill>
+                <a:latin typeface="+mn-lt"/>
+                <a:ea typeface="+mn-ea"/>
+                <a:cs typeface="+mn-cs"/>
+              </a:defRPr>
+            </a:pPr>
+            <a:endParaRPr lang="en-US"/>
+          </a:p>
+        </c:txPr>
+        <c:crossAx val="29655519"/>
+        <c:crosses val="autoZero"/>
+        <c:crossBetween val="between"/>
+      </c:valAx>
+      <c:spPr>
+        <a:noFill/>
+        <a:ln>
+          <a:solidFill>
+            <a:schemeClr val="accent5">
+              <a:lumMod val="60000"/>
+              <a:lumOff val="40000"/>
+            </a:schemeClr>
+          </a:solidFill>
+        </a:ln>
+        <a:effectLst/>
+      </c:spPr>
+    </c:plotArea>
+    <c:legend>
+      <c:legendPos val="b"/>
+      <c:overlay val="0"/>
+      <c:spPr>
+        <a:noFill/>
+        <a:ln>
+          <a:noFill/>
+        </a:ln>
+        <a:effectLst/>
+      </c:spPr>
+      <c:txPr>
+        <a:bodyPr rot="0" spcFirstLastPara="1" vertOverflow="ellipsis" vert="horz" wrap="square" anchor="ctr" anchorCtr="1"/>
+        <a:lstStyle/>
+        <a:p>
+          <a:pPr>
+            <a:defRPr sz="900" b="0" i="0" u="none" strike="noStrike" kern="1200" baseline="0">
+              <a:solidFill>
+                <a:schemeClr val="tx1">
+                  <a:lumMod val="65000"/>
+                  <a:lumOff val="35000"/>
+                </a:schemeClr>
+              </a:solidFill>
+              <a:latin typeface="+mn-lt"/>
+              <a:ea typeface="+mn-ea"/>
+              <a:cs typeface="+mn-cs"/>
+            </a:defRPr>
+          </a:pPr>
+          <a:endParaRPr lang="en-US"/>
+        </a:p>
+      </c:txPr>
+    </c:legend>
+    <c:plotVisOnly val="1"/>
+    <c:dispBlanksAs val="gap"/>
+    <c:showDLblsOverMax val="0"/>
+  </c:chart>
+  <c:spPr>
+    <a:solidFill>
+      <a:schemeClr val="bg1"/>
+    </a:solidFill>
+    <a:ln w="9525" cap="flat" cmpd="sng" algn="ctr">
+      <a:solidFill>
+        <a:schemeClr val="tx1">
+          <a:lumMod val="15000"/>
+          <a:lumOff val="85000"/>
+        </a:schemeClr>
+      </a:solidFill>
+      <a:round/>
+    </a:ln>
+    <a:effectLst/>
+  </c:spPr>
+  <c:txPr>
+    <a:bodyPr/>
+    <a:lstStyle/>
+    <a:p>
+      <a:pPr>
+        <a:defRPr/>
+      </a:pPr>
+      <a:endParaRPr lang="en-US"/>
+    </a:p>
+  </c:txPr>
+  <c:externalData r:id="rId3">
+    <c:autoUpdate val="0"/>
+  </c:externalData>
+</c:chartSpace>
+</file>
+
+<file path=word/charts/chart3.xml><?xml version="1.0" encoding="utf-8"?>
+<c:chartSpace xmlns:c="http://schemas.openxmlformats.org/drawingml/2006/chart" xmlns:a="http://schemas.openxmlformats.org/drawingml/2006/main" xmlns:r="http://schemas.openxmlformats.org/officeDocument/2006/relationships" xmlns:c16r2="http://schemas.microsoft.com/office/drawing/2015/06/chart">
+  <c:date1904 val="0"/>
+  <c:lang val="en-US"/>
+  <c:roundedCorners val="0"/>
+  <mc:AlternateContent xmlns:mc="http://schemas.openxmlformats.org/markup-compatibility/2006">
+    <mc:Choice xmlns:c14="http://schemas.microsoft.com/office/drawing/2007/8/2/chart" Requires="c14">
+      <c14:style val="102"/>
+    </mc:Choice>
+    <mc:Fallback>
+      <c:style val="2"/>
+    </mc:Fallback>
+  </mc:AlternateContent>
+  <c:chart>
+    <c:title>
+      <c:tx>
+        <c:rich>
+          <a:bodyPr rot="0" spcFirstLastPara="1" vertOverflow="ellipsis" vert="horz" wrap="square" anchor="ctr" anchorCtr="1"/>
+          <a:lstStyle/>
+          <a:p>
+            <a:pPr>
+              <a:defRPr sz="1400" b="0" i="0" u="none" strike="noStrike" kern="1200" spc="0" baseline="0">
+                <a:solidFill>
+                  <a:schemeClr val="tx1">
+                    <a:lumMod val="65000"/>
+                    <a:lumOff val="35000"/>
+                  </a:schemeClr>
+                </a:solidFill>
+                <a:latin typeface="+mn-lt"/>
+                <a:ea typeface="+mn-ea"/>
+                <a:cs typeface="+mn-cs"/>
+              </a:defRPr>
+            </a:pPr>
+            <a:r>
+              <a:rPr lang="en-US"/>
+              <a:t>F1</a:t>
+            </a:r>
+            <a:r>
+              <a:rPr lang="sr-Cyrl-RS" baseline="0"/>
+              <a:t> мера по типу ентитета (релаксирана метрика)</a:t>
+            </a:r>
+            <a:endParaRPr lang="en-US"/>
+          </a:p>
+        </c:rich>
+      </c:tx>
+      <c:overlay val="0"/>
+      <c:spPr>
+        <a:noFill/>
+        <a:ln>
+          <a:noFill/>
+        </a:ln>
+        <a:effectLst/>
+      </c:spPr>
+      <c:txPr>
+        <a:bodyPr rot="0" spcFirstLastPara="1" vertOverflow="ellipsis" vert="horz" wrap="square" anchor="ctr" anchorCtr="1"/>
+        <a:lstStyle/>
+        <a:p>
+          <a:pPr>
+            <a:defRPr sz="1400" b="0" i="0" u="none" strike="noStrike" kern="1200" spc="0" baseline="0">
+              <a:solidFill>
+                <a:schemeClr val="tx1">
+                  <a:lumMod val="65000"/>
+                  <a:lumOff val="35000"/>
+                </a:schemeClr>
+              </a:solidFill>
+              <a:latin typeface="+mn-lt"/>
+              <a:ea typeface="+mn-ea"/>
+              <a:cs typeface="+mn-cs"/>
+            </a:defRPr>
+          </a:pPr>
+          <a:endParaRPr lang="en-US"/>
+        </a:p>
+      </c:txPr>
+    </c:title>
+    <c:autoTitleDeleted val="0"/>
+    <c:plotArea>
+      <c:layout/>
+      <c:barChart>
+        <c:barDir val="col"/>
+        <c:grouping val="clustered"/>
+        <c:varyColors val="0"/>
+        <c:ser>
+          <c:idx val="0"/>
+          <c:order val="0"/>
+          <c:tx>
+            <c:strRef>
+              <c:f>Sheet1!$B$1</c:f>
+              <c:strCache>
+                <c:ptCount val="1"/>
+                <c:pt idx="0">
+                  <c:v>Qwen3- 4B инструкцијски</c:v>
+                </c:pt>
+              </c:strCache>
+            </c:strRef>
+          </c:tx>
+          <c:spPr>
+            <a:solidFill>
+              <a:schemeClr val="accent1"/>
+            </a:solidFill>
+            <a:ln>
+              <a:noFill/>
+            </a:ln>
+            <a:effectLst/>
+          </c:spPr>
+          <c:invertIfNegative val="0"/>
+          <c:cat>
+            <c:strRef>
+              <c:f>Sheet1!$A$2:$A$9</c:f>
+              <c:strCache>
+                <c:ptCount val="8"/>
+                <c:pt idx="0">
+                  <c:v>COURT</c:v>
+                </c:pt>
+                <c:pt idx="1">
+                  <c:v>DATE</c:v>
+                </c:pt>
+                <c:pt idx="2">
+                  <c:v>DECISION</c:v>
+                </c:pt>
+                <c:pt idx="3">
+                  <c:v>LAW</c:v>
+                </c:pt>
+                <c:pt idx="4">
+                  <c:v>MONEY</c:v>
+                </c:pt>
+                <c:pt idx="5">
+                  <c:v>OFF. GAZ.</c:v>
+                </c:pt>
+                <c:pt idx="6">
+                  <c:v>PERSON</c:v>
+                </c:pt>
+                <c:pt idx="7">
+                  <c:v>REFER.</c:v>
+                </c:pt>
+              </c:strCache>
+            </c:strRef>
+          </c:cat>
+          <c:val>
+            <c:numRef>
+              <c:f>Sheet1!$B$2:$B$9</c:f>
+              <c:numCache>
+                <c:formatCode>General</c:formatCode>
+                <c:ptCount val="8"/>
+                <c:pt idx="0">
+                  <c:v>0.54</c:v>
+                </c:pt>
+                <c:pt idx="1">
+                  <c:v>0.38</c:v>
+                </c:pt>
+                <c:pt idx="2">
+                  <c:v>0.04</c:v>
+                </c:pt>
+                <c:pt idx="3">
+                  <c:v>0.25</c:v>
+                </c:pt>
+                <c:pt idx="4">
+                  <c:v>0.34</c:v>
+                </c:pt>
+                <c:pt idx="5">
+                  <c:v>0.41</c:v>
+                </c:pt>
+                <c:pt idx="6">
+                  <c:v>0.05</c:v>
+                </c:pt>
+                <c:pt idx="7">
+                  <c:v>0.08</c:v>
+                </c:pt>
+              </c:numCache>
+            </c:numRef>
+          </c:val>
+          <c:extLst>
+            <c:ext xmlns:c16="http://schemas.microsoft.com/office/drawing/2014/chart" uri="{C3380CC4-5D6E-409C-BE32-E72D297353CC}">
+              <c16:uniqueId val="{00000000-3F38-4C62-981C-F7AD9631F982}"/>
+            </c:ext>
+          </c:extLst>
+        </c:ser>
+        <c:ser>
+          <c:idx val="1"/>
+          <c:order val="1"/>
+          <c:tx>
+            <c:strRef>
+              <c:f>Sheet1!$C$1</c:f>
+              <c:strCache>
+                <c:ptCount val="1"/>
+                <c:pt idx="0">
+                  <c:v>Qwen3- 4B мислећи</c:v>
+                </c:pt>
+              </c:strCache>
+            </c:strRef>
+          </c:tx>
+          <c:spPr>
+            <a:solidFill>
+              <a:schemeClr val="accent2"/>
+            </a:solidFill>
+            <a:ln>
+              <a:noFill/>
+            </a:ln>
+            <a:effectLst/>
+          </c:spPr>
+          <c:invertIfNegative val="0"/>
+          <c:cat>
+            <c:strRef>
+              <c:f>Sheet1!$A$2:$A$9</c:f>
+              <c:strCache>
+                <c:ptCount val="8"/>
+                <c:pt idx="0">
+                  <c:v>COURT</c:v>
+                </c:pt>
+                <c:pt idx="1">
+                  <c:v>DATE</c:v>
+                </c:pt>
+                <c:pt idx="2">
+                  <c:v>DECISION</c:v>
+                </c:pt>
+                <c:pt idx="3">
+                  <c:v>LAW</c:v>
+                </c:pt>
+                <c:pt idx="4">
+                  <c:v>MONEY</c:v>
+                </c:pt>
+                <c:pt idx="5">
+                  <c:v>OFF. GAZ.</c:v>
+                </c:pt>
+                <c:pt idx="6">
+                  <c:v>PERSON</c:v>
+                </c:pt>
+                <c:pt idx="7">
+                  <c:v>REFER.</c:v>
+                </c:pt>
+              </c:strCache>
+            </c:strRef>
+          </c:cat>
+          <c:val>
+            <c:numRef>
+              <c:f>Sheet1!$C$2:$C$9</c:f>
+              <c:numCache>
+                <c:formatCode>General</c:formatCode>
+                <c:ptCount val="8"/>
+                <c:pt idx="0">
+                  <c:v>0.55000000000000004</c:v>
+                </c:pt>
+                <c:pt idx="1">
+                  <c:v>0.17</c:v>
+                </c:pt>
+                <c:pt idx="2">
+                  <c:v>7.0000000000000007E-2</c:v>
+                </c:pt>
+                <c:pt idx="3">
+                  <c:v>0.36</c:v>
+                </c:pt>
+                <c:pt idx="4">
+                  <c:v>0.28999999999999998</c:v>
+                </c:pt>
+                <c:pt idx="5">
+                  <c:v>0.21</c:v>
+                </c:pt>
+                <c:pt idx="6">
+                  <c:v>0</c:v>
+                </c:pt>
+                <c:pt idx="7">
+                  <c:v>0.09</c:v>
+                </c:pt>
+              </c:numCache>
+            </c:numRef>
+          </c:val>
+          <c:extLst>
+            <c:ext xmlns:c16="http://schemas.microsoft.com/office/drawing/2014/chart" uri="{C3380CC4-5D6E-409C-BE32-E72D297353CC}">
+              <c16:uniqueId val="{00000001-3F38-4C62-981C-F7AD9631F982}"/>
+            </c:ext>
+          </c:extLst>
+        </c:ser>
+        <c:ser>
+          <c:idx val="2"/>
+          <c:order val="2"/>
+          <c:tx>
+            <c:strRef>
+              <c:f>Sheet1!$D$1</c:f>
+              <c:strCache>
+                <c:ptCount val="1"/>
+                <c:pt idx="0">
+                  <c:v>Qwen3- 30B инструкцијски2</c:v>
+                </c:pt>
+              </c:strCache>
+            </c:strRef>
+          </c:tx>
+          <c:spPr>
+            <a:solidFill>
+              <a:schemeClr val="accent3"/>
+            </a:solidFill>
+            <a:ln>
+              <a:noFill/>
+            </a:ln>
+            <a:effectLst/>
+          </c:spPr>
+          <c:invertIfNegative val="0"/>
+          <c:cat>
+            <c:strRef>
+              <c:f>Sheet1!$A$2:$A$9</c:f>
+              <c:strCache>
+                <c:ptCount val="8"/>
+                <c:pt idx="0">
+                  <c:v>COURT</c:v>
+                </c:pt>
+                <c:pt idx="1">
+                  <c:v>DATE</c:v>
+                </c:pt>
+                <c:pt idx="2">
+                  <c:v>DECISION</c:v>
+                </c:pt>
+                <c:pt idx="3">
+                  <c:v>LAW</c:v>
+                </c:pt>
+                <c:pt idx="4">
+                  <c:v>MONEY</c:v>
+                </c:pt>
+                <c:pt idx="5">
+                  <c:v>OFF. GAZ.</c:v>
+                </c:pt>
+                <c:pt idx="6">
+                  <c:v>PERSON</c:v>
+                </c:pt>
+                <c:pt idx="7">
+                  <c:v>REFER.</c:v>
+                </c:pt>
+              </c:strCache>
+            </c:strRef>
+          </c:cat>
+          <c:val>
+            <c:numRef>
+              <c:f>Sheet1!$D$2:$D$9</c:f>
+              <c:numCache>
+                <c:formatCode>General</c:formatCode>
+                <c:ptCount val="8"/>
+                <c:pt idx="0">
+                  <c:v>0.45</c:v>
+                </c:pt>
+                <c:pt idx="1">
+                  <c:v>0.63</c:v>
+                </c:pt>
+                <c:pt idx="2">
+                  <c:v>0.04</c:v>
+                </c:pt>
+                <c:pt idx="3">
+                  <c:v>0.28999999999999998</c:v>
+                </c:pt>
+                <c:pt idx="4">
+                  <c:v>0.24</c:v>
+                </c:pt>
+                <c:pt idx="5">
+                  <c:v>0.43</c:v>
+                </c:pt>
+                <c:pt idx="6">
+                  <c:v>0</c:v>
+                </c:pt>
+                <c:pt idx="7">
+                  <c:v>0.26</c:v>
+                </c:pt>
+              </c:numCache>
+            </c:numRef>
+          </c:val>
+          <c:extLst>
+            <c:ext xmlns:c16="http://schemas.microsoft.com/office/drawing/2014/chart" uri="{C3380CC4-5D6E-409C-BE32-E72D297353CC}">
+              <c16:uniqueId val="{00000002-3F38-4C62-981C-F7AD9631F982}"/>
+            </c:ext>
+          </c:extLst>
+        </c:ser>
+        <c:ser>
+          <c:idx val="3"/>
+          <c:order val="3"/>
+          <c:tx>
+            <c:strRef>
+              <c:f>Sheet1!$E$1</c:f>
+              <c:strCache>
+                <c:ptCount val="1"/>
+                <c:pt idx="0">
+                  <c:v>Qwen3- 30B мислећи</c:v>
+                </c:pt>
+              </c:strCache>
+            </c:strRef>
+          </c:tx>
+          <c:spPr>
+            <a:solidFill>
+              <a:schemeClr val="accent4"/>
+            </a:solidFill>
+            <a:ln>
+              <a:noFill/>
+            </a:ln>
+            <a:effectLst/>
+          </c:spPr>
+          <c:invertIfNegative val="0"/>
+          <c:cat>
+            <c:strRef>
+              <c:f>Sheet1!$A$2:$A$9</c:f>
+              <c:strCache>
+                <c:ptCount val="8"/>
+                <c:pt idx="0">
+                  <c:v>COURT</c:v>
+                </c:pt>
+                <c:pt idx="1">
+                  <c:v>DATE</c:v>
+                </c:pt>
+                <c:pt idx="2">
+                  <c:v>DECISION</c:v>
+                </c:pt>
+                <c:pt idx="3">
+                  <c:v>LAW</c:v>
+                </c:pt>
+                <c:pt idx="4">
+                  <c:v>MONEY</c:v>
+                </c:pt>
+                <c:pt idx="5">
+                  <c:v>OFF. GAZ.</c:v>
+                </c:pt>
+                <c:pt idx="6">
+                  <c:v>PERSON</c:v>
+                </c:pt>
+                <c:pt idx="7">
+                  <c:v>REFER.</c:v>
+                </c:pt>
+              </c:strCache>
+            </c:strRef>
+          </c:cat>
+          <c:val>
+            <c:numRef>
+              <c:f>Sheet1!$E$2:$E$9</c:f>
+              <c:numCache>
+                <c:formatCode>General</c:formatCode>
+                <c:ptCount val="8"/>
+                <c:pt idx="0">
+                  <c:v>0.63</c:v>
+                </c:pt>
+                <c:pt idx="1">
+                  <c:v>0.4</c:v>
+                </c:pt>
+                <c:pt idx="2">
+                  <c:v>0.1</c:v>
+                </c:pt>
+                <c:pt idx="3">
+                  <c:v>0.45</c:v>
+                </c:pt>
+                <c:pt idx="4">
+                  <c:v>0.28999999999999998</c:v>
+                </c:pt>
+                <c:pt idx="5">
+                  <c:v>0.19</c:v>
+                </c:pt>
+                <c:pt idx="6">
+                  <c:v>0</c:v>
+                </c:pt>
+                <c:pt idx="7">
+                  <c:v>0.33</c:v>
+                </c:pt>
+              </c:numCache>
+            </c:numRef>
+          </c:val>
+          <c:extLst>
+            <c:ext xmlns:c16="http://schemas.microsoft.com/office/drawing/2014/chart" uri="{C3380CC4-5D6E-409C-BE32-E72D297353CC}">
+              <c16:uniqueId val="{00000003-3F38-4C62-981C-F7AD9631F982}"/>
+            </c:ext>
+          </c:extLst>
+        </c:ser>
+        <c:ser>
+          <c:idx val="4"/>
+          <c:order val="4"/>
+          <c:tx>
+            <c:strRef>
+              <c:f>Sheet1!$F$1</c:f>
+              <c:strCache>
+                <c:ptCount val="1"/>
+                <c:pt idx="0">
+                  <c:v>NER4Legal</c:v>
+                </c:pt>
+              </c:strCache>
+            </c:strRef>
+          </c:tx>
+          <c:spPr>
+            <a:solidFill>
+              <a:schemeClr val="accent5"/>
+            </a:solidFill>
+            <a:ln>
+              <a:noFill/>
+            </a:ln>
+            <a:effectLst/>
+          </c:spPr>
+          <c:invertIfNegative val="0"/>
+          <c:cat>
+            <c:strRef>
+              <c:f>Sheet1!$A$2:$A$9</c:f>
+              <c:strCache>
+                <c:ptCount val="8"/>
+                <c:pt idx="0">
+                  <c:v>COURT</c:v>
+                </c:pt>
+                <c:pt idx="1">
+                  <c:v>DATE</c:v>
+                </c:pt>
+                <c:pt idx="2">
+                  <c:v>DECISION</c:v>
+                </c:pt>
+                <c:pt idx="3">
+                  <c:v>LAW</c:v>
+                </c:pt>
+                <c:pt idx="4">
+                  <c:v>MONEY</c:v>
+                </c:pt>
+                <c:pt idx="5">
+                  <c:v>OFF. GAZ.</c:v>
+                </c:pt>
+                <c:pt idx="6">
+                  <c:v>PERSON</c:v>
+                </c:pt>
+                <c:pt idx="7">
+                  <c:v>REFER.</c:v>
+                </c:pt>
+              </c:strCache>
+            </c:strRef>
+          </c:cat>
+          <c:val>
+            <c:numRef>
+              <c:f>Sheet1!$F$2:$F$9</c:f>
+              <c:numCache>
+                <c:formatCode>General</c:formatCode>
+                <c:ptCount val="8"/>
+                <c:pt idx="0">
+                  <c:v>0.03</c:v>
+                </c:pt>
+                <c:pt idx="1">
+                  <c:v>0.63</c:v>
+                </c:pt>
+                <c:pt idx="2">
+                  <c:v>0</c:v>
+                </c:pt>
+                <c:pt idx="3">
+                  <c:v>0.16</c:v>
+                </c:pt>
+                <c:pt idx="4">
+                  <c:v>0.65</c:v>
+                </c:pt>
+                <c:pt idx="5">
+                  <c:v>0.55000000000000004</c:v>
+                </c:pt>
+                <c:pt idx="6">
+                  <c:v>0</c:v>
+                </c:pt>
+                <c:pt idx="7">
+                  <c:v>0.03</c:v>
+                </c:pt>
+              </c:numCache>
+            </c:numRef>
+          </c:val>
+          <c:extLst>
+            <c:ext xmlns:c16="http://schemas.microsoft.com/office/drawing/2014/chart" uri="{C3380CC4-5D6E-409C-BE32-E72D297353CC}">
+              <c16:uniqueId val="{00000004-3F38-4C62-981C-F7AD9631F982}"/>
+            </c:ext>
+          </c:extLst>
+        </c:ser>
+        <c:dLbls>
+          <c:showLegendKey val="0"/>
+          <c:showVal val="0"/>
+          <c:showCatName val="0"/>
+          <c:showSerName val="0"/>
+          <c:showPercent val="0"/>
+          <c:showBubbleSize val="0"/>
+        </c:dLbls>
+        <c:gapWidth val="219"/>
+        <c:overlap val="-27"/>
+        <c:axId val="677805199"/>
+        <c:axId val="677805615"/>
+      </c:barChart>
+      <c:catAx>
+        <c:axId val="677805199"/>
+        <c:scaling>
+          <c:orientation val="minMax"/>
+        </c:scaling>
+        <c:delete val="0"/>
+        <c:axPos val="b"/>
+        <c:numFmt formatCode="General" sourceLinked="1"/>
+        <c:majorTickMark val="none"/>
+        <c:minorTickMark val="none"/>
+        <c:tickLblPos val="nextTo"/>
+        <c:spPr>
+          <a:noFill/>
+          <a:ln w="9525" cap="flat" cmpd="sng" algn="ctr">
+            <a:solidFill>
+              <a:schemeClr val="tx1">
+                <a:lumMod val="15000"/>
+                <a:lumOff val="85000"/>
+              </a:schemeClr>
+            </a:solidFill>
+            <a:round/>
+          </a:ln>
+          <a:effectLst/>
+        </c:spPr>
+        <c:txPr>
+          <a:bodyPr rot="-60000000" spcFirstLastPara="1" vertOverflow="ellipsis" vert="horz" wrap="square" anchor="ctr" anchorCtr="1"/>
+          <a:lstStyle/>
+          <a:p>
+            <a:pPr>
+              <a:defRPr sz="900" b="0" i="0" u="none" strike="noStrike" kern="1200" baseline="0">
+                <a:solidFill>
+                  <a:schemeClr val="tx1">
+                    <a:lumMod val="65000"/>
+                    <a:lumOff val="35000"/>
+                  </a:schemeClr>
+                </a:solidFill>
+                <a:latin typeface="+mn-lt"/>
+                <a:ea typeface="+mn-ea"/>
+                <a:cs typeface="+mn-cs"/>
+              </a:defRPr>
+            </a:pPr>
+            <a:endParaRPr lang="en-US"/>
+          </a:p>
+        </c:txPr>
+        <c:crossAx val="677805615"/>
+        <c:crosses val="autoZero"/>
+        <c:auto val="1"/>
+        <c:lblAlgn val="ctr"/>
+        <c:lblOffset val="100"/>
+        <c:noMultiLvlLbl val="0"/>
+      </c:catAx>
+      <c:valAx>
+        <c:axId val="677805615"/>
+        <c:scaling>
+          <c:orientation val="minMax"/>
+        </c:scaling>
+        <c:delete val="0"/>
+        <c:axPos val="l"/>
+        <c:majorGridlines>
+          <c:spPr>
+            <a:ln w="9525" cap="flat" cmpd="sng" algn="ctr">
+              <a:solidFill>
+                <a:schemeClr val="tx1">
+                  <a:lumMod val="15000"/>
+                  <a:lumOff val="85000"/>
+                </a:schemeClr>
+              </a:solidFill>
+              <a:round/>
+            </a:ln>
+            <a:effectLst/>
+          </c:spPr>
+        </c:majorGridlines>
+        <c:numFmt formatCode="General" sourceLinked="1"/>
+        <c:majorTickMark val="none"/>
+        <c:minorTickMark val="none"/>
+        <c:tickLblPos val="nextTo"/>
+        <c:spPr>
+          <a:noFill/>
+          <a:ln>
+            <a:noFill/>
+          </a:ln>
+          <a:effectLst/>
+        </c:spPr>
+        <c:txPr>
+          <a:bodyPr rot="-60000000" spcFirstLastPara="1" vertOverflow="ellipsis" vert="horz" wrap="square" anchor="ctr" anchorCtr="1"/>
+          <a:lstStyle/>
+          <a:p>
+            <a:pPr>
+              <a:defRPr sz="900" b="0" i="0" u="none" strike="noStrike" kern="1200" baseline="0">
+                <a:solidFill>
+                  <a:schemeClr val="tx1">
+                    <a:lumMod val="65000"/>
+                    <a:lumOff val="35000"/>
+                  </a:schemeClr>
+                </a:solidFill>
+                <a:latin typeface="+mn-lt"/>
+                <a:ea typeface="+mn-ea"/>
+                <a:cs typeface="+mn-cs"/>
+              </a:defRPr>
+            </a:pPr>
+            <a:endParaRPr lang="en-US"/>
+          </a:p>
+        </c:txPr>
+        <c:crossAx val="677805199"/>
+        <c:crosses val="autoZero"/>
+        <c:crossBetween val="between"/>
+      </c:valAx>
+      <c:spPr>
+        <a:noFill/>
+        <a:ln>
+          <a:noFill/>
+        </a:ln>
+        <a:effectLst/>
+      </c:spPr>
+    </c:plotArea>
+    <c:legend>
+      <c:legendPos val="b"/>
+      <c:overlay val="0"/>
+      <c:spPr>
+        <a:noFill/>
+        <a:ln>
+          <a:noFill/>
+        </a:ln>
+        <a:effectLst/>
+      </c:spPr>
+      <c:txPr>
+        <a:bodyPr rot="0" spcFirstLastPara="1" vertOverflow="ellipsis" vert="horz" wrap="square" anchor="ctr" anchorCtr="1"/>
+        <a:lstStyle/>
+        <a:p>
+          <a:pPr>
+            <a:defRPr sz="900" b="0" i="0" u="none" strike="noStrike" kern="1200" baseline="0">
+              <a:solidFill>
+                <a:schemeClr val="tx1">
+                  <a:lumMod val="65000"/>
+                  <a:lumOff val="35000"/>
+                </a:schemeClr>
+              </a:solidFill>
+              <a:latin typeface="+mn-lt"/>
+              <a:ea typeface="+mn-ea"/>
+              <a:cs typeface="+mn-cs"/>
+            </a:defRPr>
+          </a:pPr>
+          <a:endParaRPr lang="en-US"/>
+        </a:p>
+      </c:txPr>
+    </c:legend>
+    <c:plotVisOnly val="1"/>
+    <c:dispBlanksAs val="gap"/>
+    <c:showDLblsOverMax val="0"/>
+  </c:chart>
+  <c:spPr>
+    <a:solidFill>
+      <a:schemeClr val="bg1"/>
+    </a:solidFill>
+    <a:ln w="9525" cap="flat" cmpd="sng" algn="ctr">
+      <a:solidFill>
+        <a:schemeClr val="tx1">
+          <a:lumMod val="15000"/>
+          <a:lumOff val="85000"/>
+        </a:schemeClr>
+      </a:solidFill>
+      <a:round/>
+    </a:ln>
+    <a:effectLst/>
+  </c:spPr>
+  <c:txPr>
+    <a:bodyPr/>
+    <a:lstStyle/>
+    <a:p>
+      <a:pPr>
+        <a:defRPr/>
+      </a:pPr>
+      <a:endParaRPr lang="en-US"/>
+    </a:p>
+  </c:txPr>
+  <c:externalData r:id="rId3">
+    <c:autoUpdate val="0"/>
+  </c:externalData>
+</c:chartSpace>
+</file>
+
+<file path=word/charts/colors1.xml><?xml version="1.0" encoding="utf-8"?>
+<cs:colorStyle xmlns:cs="http://schemas.microsoft.com/office/drawing/2012/chartStyle" xmlns:a="http://schemas.openxmlformats.org/drawingml/2006/main" meth="cycle" id="10">
+  <a:schemeClr val="accent1"/>
+  <a:schemeClr val="accent2"/>
+  <a:schemeClr val="accent3"/>
+  <a:schemeClr val="accent4"/>
+  <a:schemeClr val="accent5"/>
+  <a:schemeClr val="accent6"/>
+  <cs:variation/>
+  <cs:variation>
+    <a:lumMod val="60000"/>
+  </cs:variation>
+  <cs:variation>
+    <a:lumMod val="80000"/>
+    <a:lumOff val="20000"/>
+  </cs:variation>
+  <cs:variation>
+    <a:lumMod val="80000"/>
+  </cs:variation>
+  <cs:variation>
+    <a:lumMod val="60000"/>
+    <a:lumOff val="40000"/>
+  </cs:variation>
+  <cs:variation>
+    <a:lumMod val="50000"/>
+  </cs:variation>
+  <cs:variation>
+    <a:lumMod val="70000"/>
+    <a:lumOff val="30000"/>
+  </cs:variation>
+  <cs:variation>
+    <a:lumMod val="70000"/>
+  </cs:variation>
+  <cs:variation>
+    <a:lumMod val="50000"/>
+    <a:lumOff val="50000"/>
+  </cs:variation>
+</cs:colorStyle>
+</file>
+
+<file path=word/charts/colors2.xml><?xml version="1.0" encoding="utf-8"?>
+<cs:colorStyle xmlns:cs="http://schemas.microsoft.com/office/drawing/2012/chartStyle" xmlns:a="http://schemas.openxmlformats.org/drawingml/2006/main" meth="cycle" id="10">
+  <a:schemeClr val="accent1"/>
+  <a:schemeClr val="accent2"/>
+  <a:schemeClr val="accent3"/>
+  <a:schemeClr val="accent4"/>
+  <a:schemeClr val="accent5"/>
+  <a:schemeClr val="accent6"/>
+  <cs:variation/>
+  <cs:variation>
+    <a:lumMod val="60000"/>
+  </cs:variation>
+  <cs:variation>
+    <a:lumMod val="80000"/>
+    <a:lumOff val="20000"/>
+  </cs:variation>
+  <cs:variation>
+    <a:lumMod val="80000"/>
+  </cs:variation>
+  <cs:variation>
+    <a:lumMod val="60000"/>
+    <a:lumOff val="40000"/>
+  </cs:variation>
+  <cs:variation>
+    <a:lumMod val="50000"/>
+  </cs:variation>
+  <cs:variation>
+    <a:lumMod val="70000"/>
+    <a:lumOff val="30000"/>
+  </cs:variation>
+  <cs:variation>
+    <a:lumMod val="70000"/>
+  </cs:variation>
+  <cs:variation>
+    <a:lumMod val="50000"/>
+    <a:lumOff val="50000"/>
+  </cs:variation>
+</cs:colorStyle>
+</file>
+
+<file path=word/charts/colors3.xml><?xml version="1.0" encoding="utf-8"?>
+<cs:colorStyle xmlns:cs="http://schemas.microsoft.com/office/drawing/2012/chartStyle" xmlns:a="http://schemas.openxmlformats.org/drawingml/2006/main" meth="cycle" id="10">
+  <a:schemeClr val="accent1"/>
+  <a:schemeClr val="accent2"/>
+  <a:schemeClr val="accent3"/>
+  <a:schemeClr val="accent4"/>
+  <a:schemeClr val="accent5"/>
+  <a:schemeClr val="accent6"/>
+  <cs:variation/>
+  <cs:variation>
+    <a:lumMod val="60000"/>
+  </cs:variation>
+  <cs:variation>
+    <a:lumMod val="80000"/>
+    <a:lumOff val="20000"/>
+  </cs:variation>
+  <cs:variation>
+    <a:lumMod val="80000"/>
+  </cs:variation>
+  <cs:variation>
+    <a:lumMod val="60000"/>
+    <a:lumOff val="40000"/>
+  </cs:variation>
+  <cs:variation>
+    <a:lumMod val="50000"/>
+  </cs:variation>
+  <cs:variation>
+    <a:lumMod val="70000"/>
+    <a:lumOff val="30000"/>
+  </cs:variation>
+  <cs:variation>
+    <a:lumMod val="70000"/>
+  </cs:variation>
+  <cs:variation>
+    <a:lumMod val="50000"/>
+    <a:lumOff val="50000"/>
+  </cs:variation>
+</cs:colorStyle>
+</file>
+
+<file path=word/charts/style1.xml><?xml version="1.0" encoding="utf-8"?>
+<cs:chartStyle xmlns:cs="http://schemas.microsoft.com/office/drawing/2012/chartStyle" xmlns:a="http://schemas.openxmlformats.org/drawingml/2006/main" id="201">
+  <cs:axisTitle>
+    <cs:lnRef idx="0"/>
+    <cs:fillRef idx="0"/>
+    <cs:effectRef idx="0"/>
+    <cs:fontRef idx="minor">
+      <a:schemeClr val="tx1">
+        <a:lumMod val="65000"/>
+        <a:lumOff val="35000"/>
+      </a:schemeClr>
+    </cs:fontRef>
+    <cs:defRPr sz="1000" kern="1200"/>
+  </cs:axisTitle>
+  <cs:categoryAxis>
+    <cs:lnRef idx="0"/>
+    <cs:fillRef idx="0"/>
+    <cs:effectRef idx="0"/>
+    <cs:fontRef idx="minor">
+      <a:schemeClr val="tx1">
+        <a:lumMod val="65000"/>
+        <a:lumOff val="35000"/>
+      </a:schemeClr>
+    </cs:fontRef>
+    <cs:spPr>
+      <a:ln w="9525" cap="flat" cmpd="sng" algn="ctr">
+        <a:solidFill>
+          <a:schemeClr val="tx1">
+            <a:lumMod val="15000"/>
+            <a:lumOff val="85000"/>
+          </a:schemeClr>
+        </a:solidFill>
+        <a:round/>
+      </a:ln>
+    </cs:spPr>
+    <cs:defRPr sz="900" kern="1200"/>
+  </cs:categoryAxis>
+  <cs:chartArea mods="allowNoFillOverride allowNoLineOverride">
+    <cs:lnRef idx="0"/>
+    <cs:fillRef idx="0"/>
+    <cs:effectRef idx="0"/>
+    <cs:fontRef idx="minor">
+      <a:schemeClr val="tx1"/>
+    </cs:fontRef>
+    <cs:spPr>
+      <a:solidFill>
+        <a:schemeClr val="bg1"/>
+      </a:solidFill>
+      <a:ln w="9525" cap="flat" cmpd="sng" algn="ctr">
+        <a:solidFill>
+          <a:schemeClr val="tx1">
+            <a:lumMod val="15000"/>
+            <a:lumOff val="85000"/>
+          </a:schemeClr>
+        </a:solidFill>
+        <a:round/>
+      </a:ln>
+    </cs:spPr>
+    <cs:defRPr sz="1000" kern="1200"/>
+  </cs:chartArea>
+  <cs:dataLabel>
+    <cs:lnRef idx="0"/>
+    <cs:fillRef idx="0"/>
+    <cs:effectRef idx="0"/>
+    <cs:fontRef idx="minor">
+      <a:schemeClr val="tx1">
+        <a:lumMod val="75000"/>
+        <a:lumOff val="25000"/>
+      </a:schemeClr>
+    </cs:fontRef>
+    <cs:defRPr sz="900" kern="1200"/>
+  </cs:dataLabel>
+  <cs:dataLabelCallout>
+    <cs:lnRef idx="0"/>
+    <cs:fillRef idx="0"/>
+    <cs:effectRef idx="0"/>
+    <cs:fontRef idx="minor">
+      <a:schemeClr val="dk1">
+        <a:lumMod val="65000"/>
+        <a:lumOff val="35000"/>
+      </a:schemeClr>
+    </cs:fontRef>
+    <cs:spPr>
+      <a:solidFill>
+        <a:schemeClr val="lt1"/>
+      </a:solidFill>
+      <a:ln>
+        <a:solidFill>
+          <a:schemeClr val="dk1">
+            <a:lumMod val="25000"/>
+            <a:lumOff val="75000"/>
+          </a:schemeClr>
+        </a:solidFill>
+      </a:ln>
+    </cs:spPr>
+    <cs:defRPr sz="900" kern="1200"/>
+    <cs:bodyPr rot="0" spcFirstLastPara="1" vertOverflow="clip" horzOverflow="clip" vert="horz" wrap="square" lIns="36576" tIns="18288" rIns="36576" bIns="18288" anchor="ctr" anchorCtr="1">
+      <a:spAutoFit/>
+    </cs:bodyPr>
+  </cs:dataLabelCallout>
+  <cs:dataPoint>
+    <cs:lnRef idx="0"/>
+    <cs:fillRef idx="1">
+      <cs:styleClr val="auto"/>
+    </cs:fillRef>
+    <cs:effectRef idx="0"/>
+    <cs:fontRef idx="minor">
+      <a:schemeClr val="tx1"/>
+    </cs:fontRef>
+  </cs:dataPoint>
+  <cs:dataPoint3D>
+    <cs:lnRef idx="0"/>
+    <cs:fillRef idx="1">
+      <cs:styleClr val="auto"/>
+    </cs:fillRef>
+    <cs:effectRef idx="0"/>
+    <cs:fontRef idx="minor">
+      <a:schemeClr val="tx1"/>
+    </cs:fontRef>
+  </cs:dataPoint3D>
+  <cs:dataPointLine>
+    <cs:lnRef idx="0">
+      <cs:styleClr val="auto"/>
+    </cs:lnRef>
+    <cs:fillRef idx="1"/>
+    <cs:effectRef idx="0"/>
+    <cs:fontRef idx="minor">
+      <a:schemeClr val="tx1"/>
+    </cs:fontRef>
+    <cs:spPr>
+      <a:ln w="28575" cap="rnd">
+        <a:solidFill>
+          <a:schemeClr val="phClr"/>
+        </a:solidFill>
+        <a:round/>
+      </a:ln>
+    </cs:spPr>
+  </cs:dataPointLine>
+  <cs:dataPointMarker>
+    <cs:lnRef idx="0">
+      <cs:styleClr val="auto"/>
+    </cs:lnRef>
+    <cs:fillRef idx="1">
+      <cs:styleClr val="auto"/>
+    </cs:fillRef>
+    <cs:effectRef idx="0"/>
+    <cs:fontRef idx="minor">
+      <a:schemeClr val="tx1"/>
+    </cs:fontRef>
+    <cs:spPr>
+      <a:ln w="9525">
+        <a:solidFill>
+          <a:schemeClr val="phClr"/>
+        </a:solidFill>
+      </a:ln>
+    </cs:spPr>
+  </cs:dataPointMarker>
+  <cs:dataPointMarkerLayout symbol="circle" size="5"/>
+  <cs:dataPointWireframe>
+    <cs:lnRef idx="0">
+      <cs:styleClr val="auto"/>
+    </cs:lnRef>
+    <cs:fillRef idx="1"/>
+    <cs:effectRef idx="0"/>
+    <cs:fontRef idx="minor">
+      <a:schemeClr val="tx1"/>
+    </cs:fontRef>
+    <cs:spPr>
+      <a:ln w="9525" cap="rnd">
+        <a:solidFill>
+          <a:schemeClr val="phClr"/>
+        </a:solidFill>
+        <a:round/>
+      </a:ln>
+    </cs:spPr>
+  </cs:dataPointWireframe>
+  <cs:dataTable>
+    <cs:lnRef idx="0"/>
+    <cs:fillRef idx="0"/>
+    <cs:effectRef idx="0"/>
+    <cs:fontRef idx="minor">
+      <a:schemeClr val="tx1">
+        <a:lumMod val="65000"/>
+        <a:lumOff val="35000"/>
+      </a:schemeClr>
+    </cs:fontRef>
+    <cs:spPr>
+      <a:noFill/>
+      <a:ln w="9525" cap="flat" cmpd="sng" algn="ctr">
+        <a:solidFill>
+          <a:schemeClr val="tx1">
+            <a:lumMod val="15000"/>
+            <a:lumOff val="85000"/>
+          </a:schemeClr>
+        </a:solidFill>
+        <a:round/>
+      </a:ln>
+    </cs:spPr>
+    <cs:defRPr sz="900" kern="1200"/>
+  </cs:dataTable>
+  <cs:downBar>
+    <cs:lnRef idx="0"/>
+    <cs:fillRef idx="0"/>
+    <cs:effectRef idx="0"/>
+    <cs:fontRef idx="minor">
+      <a:schemeClr val="dk1"/>
+    </cs:fontRef>
+    <cs:spPr>
+      <a:solidFill>
+        <a:schemeClr val="dk1">
+          <a:lumMod val="65000"/>
+          <a:lumOff val="35000"/>
+        </a:schemeClr>
+      </a:solidFill>
+      <a:ln w="9525">
+        <a:solidFill>
+          <a:schemeClr val="tx1">
+            <a:lumMod val="65000"/>
+            <a:lumOff val="35000"/>
+          </a:schemeClr>
+        </a:solidFill>
+      </a:ln>
+    </cs:spPr>
+  </cs:downBar>
+  <cs:dropLine>
+    <cs:lnRef idx="0"/>
+    <cs:fillRef idx="0"/>
+    <cs:effectRef idx="0"/>
+    <cs:fontRef idx="minor">
+      <a:schemeClr val="tx1"/>
+    </cs:fontRef>
+    <cs:spPr>
+      <a:ln w="9525" cap="flat" cmpd="sng" algn="ctr">
+        <a:solidFill>
+          <a:schemeClr val="tx1">
+            <a:lumMod val="35000"/>
+            <a:lumOff val="65000"/>
+          </a:schemeClr>
+        </a:solidFill>
+        <a:round/>
+      </a:ln>
+    </cs:spPr>
+  </cs:dropLine>
+  <cs:errorBar>
+    <cs:lnRef idx="0"/>
+    <cs:fillRef idx="0"/>
+    <cs:effectRef idx="0"/>
+    <cs:fontRef idx="minor">
+      <a:schemeClr val="tx1"/>
+    </cs:fontRef>
+    <cs:spPr>
+      <a:ln w="9525" cap="flat" cmpd="sng" algn="ctr">
+        <a:solidFill>
+          <a:schemeClr val="tx1">
+            <a:lumMod val="65000"/>
+            <a:lumOff val="35000"/>
+          </a:schemeClr>
+        </a:solidFill>
+        <a:round/>
+      </a:ln>
+    </cs:spPr>
+  </cs:errorBar>
+  <cs:floor>
+    <cs:lnRef idx="0"/>
+    <cs:fillRef idx="0"/>
+    <cs:effectRef idx="0"/>
+    <cs:fontRef idx="minor">
+      <a:schemeClr val="tx1"/>
+    </cs:fontRef>
+    <cs:spPr>
+      <a:noFill/>
+      <a:ln>
+        <a:noFill/>
+      </a:ln>
+    </cs:spPr>
+  </cs:floor>
+  <cs:gridlineMajor>
+    <cs:lnRef idx="0"/>
+    <cs:fillRef idx="0"/>
+    <cs:effectRef idx="0"/>
+    <cs:fontRef idx="minor">
+      <a:schemeClr val="tx1"/>
+    </cs:fontRef>
+    <cs:spPr>
+      <a:ln w="9525" cap="flat" cmpd="sng" algn="ctr">
+        <a:solidFill>
+          <a:schemeClr val="tx1">
+            <a:lumMod val="15000"/>
+            <a:lumOff val="85000"/>
+          </a:schemeClr>
+        </a:solidFill>
+        <a:round/>
+      </a:ln>
+    </cs:spPr>
+  </cs:gridlineMajor>
+  <cs:gridlineMinor>
+    <cs:lnRef idx="0"/>
+    <cs:fillRef idx="0"/>
+    <cs:effectRef idx="0"/>
+    <cs:fontRef idx="minor">
+      <a:schemeClr val="tx1"/>
+    </cs:fontRef>
+    <cs:spPr>
+      <a:ln w="9525" cap="flat" cmpd="sng" algn="ctr">
+        <a:solidFill>
+          <a:schemeClr val="tx1">
+            <a:lumMod val="5000"/>
+            <a:lumOff val="95000"/>
+          </a:schemeClr>
+        </a:solidFill>
+        <a:round/>
+      </a:ln>
+    </cs:spPr>
+  </cs:gridlineMinor>
+  <cs:hiLoLine>
+    <cs:lnRef idx="0"/>
+    <cs:fillRef idx="0"/>
+    <cs:effectRef idx="0"/>
+    <cs:fontRef idx="minor">
+      <a:schemeClr val="tx1"/>
+    </cs:fontRef>
+    <cs:spPr>
+      <a:ln w="9525" cap="flat" cmpd="sng" algn="ctr">
+        <a:solidFill>
+          <a:schemeClr val="tx1">
+            <a:lumMod val="75000"/>
+            <a:lumOff val="25000"/>
+          </a:schemeClr>
+        </a:solidFill>
+        <a:round/>
+      </a:ln>
+    </cs:spPr>
+  </cs:hiLoLine>
+  <cs:leaderLine>
+    <cs:lnRef idx="0"/>
+    <cs:fillRef idx="0"/>
+    <cs:effectRef idx="0"/>
+    <cs:fontRef idx="minor">
+      <a:schemeClr val="tx1"/>
+    </cs:fontRef>
+    <cs:spPr>
+      <a:ln w="9525" cap="flat" cmpd="sng" algn="ctr">
+        <a:solidFill>
+          <a:schemeClr val="tx1">
+            <a:lumMod val="35000"/>
+            <a:lumOff val="65000"/>
+          </a:schemeClr>
+        </a:solidFill>
+        <a:round/>
+      </a:ln>
+    </cs:spPr>
+  </cs:leaderLine>
+  <cs:legend>
+    <cs:lnRef idx="0"/>
+    <cs:fillRef idx="0"/>
+    <cs:effectRef idx="0"/>
+    <cs:fontRef idx="minor">
+      <a:schemeClr val="tx1">
+        <a:lumMod val="65000"/>
+        <a:lumOff val="35000"/>
+      </a:schemeClr>
+    </cs:fontRef>
+    <cs:defRPr sz="900" kern="1200"/>
+  </cs:legend>
+  <cs:plotArea mods="allowNoFillOverride allowNoLineOverride">
+    <cs:lnRef idx="0"/>
+    <cs:fillRef idx="0"/>
+    <cs:effectRef idx="0"/>
+    <cs:fontRef idx="minor">
+      <a:schemeClr val="tx1"/>
+    </cs:fontRef>
+  </cs:plotArea>
+  <cs:plotArea3D mods="allowNoFillOverride allowNoLineOverride">
+    <cs:lnRef idx="0"/>
+    <cs:fillRef idx="0"/>
+    <cs:effectRef idx="0"/>
+    <cs:fontRef idx="minor">
+      <a:schemeClr val="tx1"/>
+    </cs:fontRef>
+  </cs:plotArea3D>
+  <cs:seriesAxis>
+    <cs:lnRef idx="0"/>
+    <cs:fillRef idx="0"/>
+    <cs:effectRef idx="0"/>
+    <cs:fontRef idx="minor">
+      <a:schemeClr val="tx1">
+        <a:lumMod val="65000"/>
+        <a:lumOff val="35000"/>
+      </a:schemeClr>
+    </cs:fontRef>
+    <cs:defRPr sz="900" kern="1200"/>
+  </cs:seriesAxis>
+  <cs:seriesLine>
+    <cs:lnRef idx="0"/>
+    <cs:fillRef idx="0"/>
+    <cs:effectRef idx="0"/>
+    <cs:fontRef idx="minor">
+      <a:schemeClr val="tx1"/>
+    </cs:fontRef>
+    <cs:spPr>
+      <a:ln w="9525" cap="flat" cmpd="sng" algn="ctr">
+        <a:solidFill>
+          <a:schemeClr val="tx1">
+            <a:lumMod val="35000"/>
+            <a:lumOff val="65000"/>
+          </a:schemeClr>
+        </a:solidFill>
+        <a:round/>
+      </a:ln>
+    </cs:spPr>
+  </cs:seriesLine>
+  <cs:title>
+    <cs:lnRef idx="0"/>
+    <cs:fillRef idx="0"/>
+    <cs:effectRef idx="0"/>
+    <cs:fontRef idx="minor">
+      <a:schemeClr val="tx1">
+        <a:lumMod val="65000"/>
+        <a:lumOff val="35000"/>
+      </a:schemeClr>
+    </cs:fontRef>
+    <cs:defRPr sz="1400" b="0" kern="1200" spc="0" baseline="0"/>
+  </cs:title>
+  <cs:trendline>
+    <cs:lnRef idx="0">
+      <cs:styleClr val="auto"/>
+    </cs:lnRef>
+    <cs:fillRef idx="0"/>
+    <cs:effectRef idx="0"/>
+    <cs:fontRef idx="minor">
+      <a:schemeClr val="tx1"/>
+    </cs:fontRef>
+    <cs:spPr>
+      <a:ln w="19050" cap="rnd">
+        <a:solidFill>
+          <a:schemeClr val="phClr"/>
+        </a:solidFill>
+        <a:prstDash val="sysDot"/>
+      </a:ln>
+    </cs:spPr>
+  </cs:trendline>
+  <cs:trendlineLabel>
+    <cs:lnRef idx="0"/>
+    <cs:fillRef idx="0"/>
+    <cs:effectRef idx="0"/>
+    <cs:fontRef idx="minor">
+      <a:schemeClr val="tx1">
+        <a:lumMod val="65000"/>
+        <a:lumOff val="35000"/>
+      </a:schemeClr>
+    </cs:fontRef>
+    <cs:defRPr sz="900" kern="1200"/>
+  </cs:trendlineLabel>
+  <cs:upBar>
+    <cs:lnRef idx="0"/>
+    <cs:fillRef idx="0"/>
+    <cs:effectRef idx="0"/>
+    <cs:fontRef idx="minor">
+      <a:schemeClr val="dk1"/>
+    </cs:fontRef>
+    <cs:spPr>
+      <a:solidFill>
+        <a:schemeClr val="lt1"/>
+      </a:solidFill>
+      <a:ln w="9525">
+        <a:solidFill>
+          <a:schemeClr val="tx1">
+            <a:lumMod val="15000"/>
+            <a:lumOff val="85000"/>
+          </a:schemeClr>
+        </a:solidFill>
+      </a:ln>
+    </cs:spPr>
+  </cs:upBar>
+  <cs:valueAxis>
+    <cs:lnRef idx="0"/>
+    <cs:fillRef idx="0"/>
+    <cs:effectRef idx="0"/>
+    <cs:fontRef idx="minor">
+      <a:schemeClr val="tx1">
+        <a:lumMod val="65000"/>
+        <a:lumOff val="35000"/>
+      </a:schemeClr>
+    </cs:fontRef>
+    <cs:defRPr sz="900" kern="1200"/>
+  </cs:valueAxis>
+  <cs:wall>
+    <cs:lnRef idx="0"/>
+    <cs:fillRef idx="0"/>
+    <cs:effectRef idx="0"/>
+    <cs:fontRef idx="minor">
+      <a:schemeClr val="tx1"/>
+    </cs:fontRef>
+    <cs:spPr>
+      <a:noFill/>
+      <a:ln>
+        <a:noFill/>
+      </a:ln>
+    </cs:spPr>
+  </cs:wall>
+</cs:chartStyle>
+</file>
+
+<file path=word/charts/style2.xml><?xml version="1.0" encoding="utf-8"?>
+<cs:chartStyle xmlns:cs="http://schemas.microsoft.com/office/drawing/2012/chartStyle" xmlns:a="http://schemas.openxmlformats.org/drawingml/2006/main" id="201">
+  <cs:axisTitle>
+    <cs:lnRef idx="0"/>
+    <cs:fillRef idx="0"/>
+    <cs:effectRef idx="0"/>
+    <cs:fontRef idx="minor">
+      <a:schemeClr val="tx1">
+        <a:lumMod val="65000"/>
+        <a:lumOff val="35000"/>
+      </a:schemeClr>
+    </cs:fontRef>
+    <cs:defRPr sz="1000" kern="1200"/>
+  </cs:axisTitle>
+  <cs:categoryAxis>
+    <cs:lnRef idx="0"/>
+    <cs:fillRef idx="0"/>
+    <cs:effectRef idx="0"/>
+    <cs:fontRef idx="minor">
+      <a:schemeClr val="tx1">
+        <a:lumMod val="65000"/>
+        <a:lumOff val="35000"/>
+      </a:schemeClr>
+    </cs:fontRef>
+    <cs:spPr>
+      <a:ln w="9525" cap="flat" cmpd="sng" algn="ctr">
+        <a:solidFill>
+          <a:schemeClr val="tx1">
+            <a:lumMod val="15000"/>
+            <a:lumOff val="85000"/>
+          </a:schemeClr>
+        </a:solidFill>
+        <a:round/>
+      </a:ln>
+    </cs:spPr>
+    <cs:defRPr sz="900" kern="1200"/>
+  </cs:categoryAxis>
+  <cs:chartArea mods="allowNoFillOverride allowNoLineOverride">
+    <cs:lnRef idx="0"/>
+    <cs:fillRef idx="0"/>
+    <cs:effectRef idx="0"/>
+    <cs:fontRef idx="minor">
+      <a:schemeClr val="tx1"/>
+    </cs:fontRef>
+    <cs:spPr>
+      <a:solidFill>
+        <a:schemeClr val="bg1"/>
+      </a:solidFill>
+      <a:ln w="9525" cap="flat" cmpd="sng" algn="ctr">
+        <a:solidFill>
+          <a:schemeClr val="tx1">
+            <a:lumMod val="15000"/>
+            <a:lumOff val="85000"/>
+          </a:schemeClr>
+        </a:solidFill>
+        <a:round/>
+      </a:ln>
+    </cs:spPr>
+    <cs:defRPr sz="1000" kern="1200"/>
+  </cs:chartArea>
+  <cs:dataLabel>
+    <cs:lnRef idx="0"/>
+    <cs:fillRef idx="0"/>
+    <cs:effectRef idx="0"/>
+    <cs:fontRef idx="minor">
+      <a:schemeClr val="tx1">
+        <a:lumMod val="75000"/>
+        <a:lumOff val="25000"/>
+      </a:schemeClr>
+    </cs:fontRef>
+    <cs:defRPr sz="900" kern="1200"/>
+  </cs:dataLabel>
+  <cs:dataLabelCallout>
+    <cs:lnRef idx="0"/>
+    <cs:fillRef idx="0"/>
+    <cs:effectRef idx="0"/>
+    <cs:fontRef idx="minor">
+      <a:schemeClr val="dk1">
+        <a:lumMod val="65000"/>
+        <a:lumOff val="35000"/>
+      </a:schemeClr>
+    </cs:fontRef>
+    <cs:spPr>
+      <a:solidFill>
+        <a:schemeClr val="lt1"/>
+      </a:solidFill>
+      <a:ln>
+        <a:solidFill>
+          <a:schemeClr val="dk1">
+            <a:lumMod val="25000"/>
+            <a:lumOff val="75000"/>
+          </a:schemeClr>
+        </a:solidFill>
+      </a:ln>
+    </cs:spPr>
+    <cs:defRPr sz="900" kern="1200"/>
+    <cs:bodyPr rot="0" spcFirstLastPara="1" vertOverflow="clip" horzOverflow="clip" vert="horz" wrap="square" lIns="36576" tIns="18288" rIns="36576" bIns="18288" anchor="ctr" anchorCtr="1">
+      <a:spAutoFit/>
+    </cs:bodyPr>
+  </cs:dataLabelCallout>
+  <cs:dataPoint>
+    <cs:lnRef idx="0"/>
+    <cs:fillRef idx="1">
+      <cs:styleClr val="auto"/>
+    </cs:fillRef>
+    <cs:effectRef idx="0"/>
+    <cs:fontRef idx="minor">
+      <a:schemeClr val="tx1"/>
+    </cs:fontRef>
+  </cs:dataPoint>
+  <cs:dataPoint3D>
+    <cs:lnRef idx="0"/>
+    <cs:fillRef idx="1">
+      <cs:styleClr val="auto"/>
+    </cs:fillRef>
+    <cs:effectRef idx="0"/>
+    <cs:fontRef idx="minor">
+      <a:schemeClr val="tx1"/>
+    </cs:fontRef>
+  </cs:dataPoint3D>
+  <cs:dataPointLine>
+    <cs:lnRef idx="0">
+      <cs:styleClr val="auto"/>
+    </cs:lnRef>
+    <cs:fillRef idx="1"/>
+    <cs:effectRef idx="0"/>
+    <cs:fontRef idx="minor">
+      <a:schemeClr val="tx1"/>
+    </cs:fontRef>
+    <cs:spPr>
+      <a:ln w="28575" cap="rnd">
+        <a:solidFill>
+          <a:schemeClr val="phClr"/>
+        </a:solidFill>
+        <a:round/>
+      </a:ln>
+    </cs:spPr>
+  </cs:dataPointLine>
+  <cs:dataPointMarker>
+    <cs:lnRef idx="0">
+      <cs:styleClr val="auto"/>
+    </cs:lnRef>
+    <cs:fillRef idx="1">
+      <cs:styleClr val="auto"/>
+    </cs:fillRef>
+    <cs:effectRef idx="0"/>
+    <cs:fontRef idx="minor">
+      <a:schemeClr val="tx1"/>
+    </cs:fontRef>
+    <cs:spPr>
+      <a:ln w="9525">
+        <a:solidFill>
+          <a:schemeClr val="phClr"/>
+        </a:solidFill>
+      </a:ln>
+    </cs:spPr>
+  </cs:dataPointMarker>
+  <cs:dataPointMarkerLayout symbol="circle" size="5"/>
+  <cs:dataPointWireframe>
+    <cs:lnRef idx="0">
+      <cs:styleClr val="auto"/>
+    </cs:lnRef>
+    <cs:fillRef idx="1"/>
+    <cs:effectRef idx="0"/>
+    <cs:fontRef idx="minor">
+      <a:schemeClr val="tx1"/>
+    </cs:fontRef>
+    <cs:spPr>
+      <a:ln w="9525" cap="rnd">
+        <a:solidFill>
+          <a:schemeClr val="phClr"/>
+        </a:solidFill>
+        <a:round/>
+      </a:ln>
+    </cs:spPr>
+  </cs:dataPointWireframe>
+  <cs:dataTable>
+    <cs:lnRef idx="0"/>
+    <cs:fillRef idx="0"/>
+    <cs:effectRef idx="0"/>
+    <cs:fontRef idx="minor">
+      <a:schemeClr val="tx1">
+        <a:lumMod val="65000"/>
+        <a:lumOff val="35000"/>
+      </a:schemeClr>
+    </cs:fontRef>
+    <cs:spPr>
+      <a:noFill/>
+      <a:ln w="9525" cap="flat" cmpd="sng" algn="ctr">
+        <a:solidFill>
+          <a:schemeClr val="tx1">
+            <a:lumMod val="15000"/>
+            <a:lumOff val="85000"/>
+          </a:schemeClr>
+        </a:solidFill>
+        <a:round/>
+      </a:ln>
+    </cs:spPr>
+    <cs:defRPr sz="900" kern="1200"/>
+  </cs:dataTable>
+  <cs:downBar>
+    <cs:lnRef idx="0"/>
+    <cs:fillRef idx="0"/>
+    <cs:effectRef idx="0"/>
+    <cs:fontRef idx="minor">
+      <a:schemeClr val="dk1"/>
+    </cs:fontRef>
+    <cs:spPr>
+      <a:solidFill>
+        <a:schemeClr val="dk1">
+          <a:lumMod val="65000"/>
+          <a:lumOff val="35000"/>
+        </a:schemeClr>
+      </a:solidFill>
+      <a:ln w="9525">
+        <a:solidFill>
+          <a:schemeClr val="tx1">
+            <a:lumMod val="65000"/>
+            <a:lumOff val="35000"/>
+          </a:schemeClr>
+        </a:solidFill>
+      </a:ln>
+    </cs:spPr>
+  </cs:downBar>
+  <cs:dropLine>
+    <cs:lnRef idx="0"/>
+    <cs:fillRef idx="0"/>
+    <cs:effectRef idx="0"/>
+    <cs:fontRef idx="minor">
+      <a:schemeClr val="tx1"/>
+    </cs:fontRef>
+    <cs:spPr>
+      <a:ln w="9525" cap="flat" cmpd="sng" algn="ctr">
+        <a:solidFill>
+          <a:schemeClr val="tx1">
+            <a:lumMod val="35000"/>
+            <a:lumOff val="65000"/>
+          </a:schemeClr>
+        </a:solidFill>
+        <a:round/>
+      </a:ln>
+    </cs:spPr>
+  </cs:dropLine>
+  <cs:errorBar>
+    <cs:lnRef idx="0"/>
+    <cs:fillRef idx="0"/>
+    <cs:effectRef idx="0"/>
+    <cs:fontRef idx="minor">
+      <a:schemeClr val="tx1"/>
+    </cs:fontRef>
+    <cs:spPr>
+      <a:ln w="9525" cap="flat" cmpd="sng" algn="ctr">
+        <a:solidFill>
+          <a:schemeClr val="tx1">
+            <a:lumMod val="65000"/>
+            <a:lumOff val="35000"/>
+          </a:schemeClr>
+        </a:solidFill>
+        <a:round/>
+      </a:ln>
+    </cs:spPr>
+  </cs:errorBar>
+  <cs:floor>
+    <cs:lnRef idx="0"/>
+    <cs:fillRef idx="0"/>
+    <cs:effectRef idx="0"/>
+    <cs:fontRef idx="minor">
+      <a:schemeClr val="tx1"/>
+    </cs:fontRef>
+    <cs:spPr>
+      <a:noFill/>
+      <a:ln>
+        <a:noFill/>
+      </a:ln>
+    </cs:spPr>
+  </cs:floor>
+  <cs:gridlineMajor>
+    <cs:lnRef idx="0"/>
+    <cs:fillRef idx="0"/>
+    <cs:effectRef idx="0"/>
+    <cs:fontRef idx="minor">
+      <a:schemeClr val="tx1"/>
+    </cs:fontRef>
+    <cs:spPr>
+      <a:ln w="9525" cap="flat" cmpd="sng" algn="ctr">
+        <a:solidFill>
+          <a:schemeClr val="tx1">
+            <a:lumMod val="15000"/>
+            <a:lumOff val="85000"/>
+          </a:schemeClr>
+        </a:solidFill>
+        <a:round/>
+      </a:ln>
+    </cs:spPr>
+  </cs:gridlineMajor>
+  <cs:gridlineMinor>
+    <cs:lnRef idx="0"/>
+    <cs:fillRef idx="0"/>
+    <cs:effectRef idx="0"/>
+    <cs:fontRef idx="minor">
+      <a:schemeClr val="tx1"/>
+    </cs:fontRef>
+    <cs:spPr>
+      <a:ln w="9525" cap="flat" cmpd="sng" algn="ctr">
+        <a:solidFill>
+          <a:schemeClr val="tx1">
+            <a:lumMod val="5000"/>
+            <a:lumOff val="95000"/>
+          </a:schemeClr>
+        </a:solidFill>
+        <a:round/>
+      </a:ln>
+    </cs:spPr>
+  </cs:gridlineMinor>
+  <cs:hiLoLine>
+    <cs:lnRef idx="0"/>
+    <cs:fillRef idx="0"/>
+    <cs:effectRef idx="0"/>
+    <cs:fontRef idx="minor">
+      <a:schemeClr val="tx1"/>
+    </cs:fontRef>
+    <cs:spPr>
+      <a:ln w="9525" cap="flat" cmpd="sng" algn="ctr">
+        <a:solidFill>
+          <a:schemeClr val="tx1">
+            <a:lumMod val="75000"/>
+            <a:lumOff val="25000"/>
+          </a:schemeClr>
+        </a:solidFill>
+        <a:round/>
+      </a:ln>
+    </cs:spPr>
+  </cs:hiLoLine>
+  <cs:leaderLine>
+    <cs:lnRef idx="0"/>
+    <cs:fillRef idx="0"/>
+    <cs:effectRef idx="0"/>
+    <cs:fontRef idx="minor">
+      <a:schemeClr val="tx1"/>
+    </cs:fontRef>
+    <cs:spPr>
+      <a:ln w="9525" cap="flat" cmpd="sng" algn="ctr">
+        <a:solidFill>
+          <a:schemeClr val="tx1">
+            <a:lumMod val="35000"/>
+            <a:lumOff val="65000"/>
+          </a:schemeClr>
+        </a:solidFill>
+        <a:round/>
+      </a:ln>
+    </cs:spPr>
+  </cs:leaderLine>
+  <cs:legend>
+    <cs:lnRef idx="0"/>
+    <cs:fillRef idx="0"/>
+    <cs:effectRef idx="0"/>
+    <cs:fontRef idx="minor">
+      <a:schemeClr val="tx1">
+        <a:lumMod val="65000"/>
+        <a:lumOff val="35000"/>
+      </a:schemeClr>
+    </cs:fontRef>
+    <cs:defRPr sz="900" kern="1200"/>
+  </cs:legend>
+  <cs:plotArea mods="allowNoFillOverride allowNoLineOverride">
+    <cs:lnRef idx="0"/>
+    <cs:fillRef idx="0"/>
+    <cs:effectRef idx="0"/>
+    <cs:fontRef idx="minor">
+      <a:schemeClr val="tx1"/>
+    </cs:fontRef>
+  </cs:plotArea>
+  <cs:plotArea3D mods="allowNoFillOverride allowNoLineOverride">
+    <cs:lnRef idx="0"/>
+    <cs:fillRef idx="0"/>
+    <cs:effectRef idx="0"/>
+    <cs:fontRef idx="minor">
+      <a:schemeClr val="tx1"/>
+    </cs:fontRef>
+  </cs:plotArea3D>
+  <cs:seriesAxis>
+    <cs:lnRef idx="0"/>
+    <cs:fillRef idx="0"/>
+    <cs:effectRef idx="0"/>
+    <cs:fontRef idx="minor">
+      <a:schemeClr val="tx1">
+        <a:lumMod val="65000"/>
+        <a:lumOff val="35000"/>
+      </a:schemeClr>
+    </cs:fontRef>
+    <cs:defRPr sz="900" kern="1200"/>
+  </cs:seriesAxis>
+  <cs:seriesLine>
+    <cs:lnRef idx="0"/>
+    <cs:fillRef idx="0"/>
+    <cs:effectRef idx="0"/>
+    <cs:fontRef idx="minor">
+      <a:schemeClr val="tx1"/>
+    </cs:fontRef>
+    <cs:spPr>
+      <a:ln w="9525" cap="flat" cmpd="sng" algn="ctr">
+        <a:solidFill>
+          <a:schemeClr val="tx1">
+            <a:lumMod val="35000"/>
+            <a:lumOff val="65000"/>
+          </a:schemeClr>
+        </a:solidFill>
+        <a:round/>
+      </a:ln>
+    </cs:spPr>
+  </cs:seriesLine>
+  <cs:title>
+    <cs:lnRef idx="0"/>
+    <cs:fillRef idx="0"/>
+    <cs:effectRef idx="0"/>
+    <cs:fontRef idx="minor">
+      <a:schemeClr val="tx1">
+        <a:lumMod val="65000"/>
+        <a:lumOff val="35000"/>
+      </a:schemeClr>
+    </cs:fontRef>
+    <cs:defRPr sz="1400" b="0" kern="1200" spc="0" baseline="0"/>
+  </cs:title>
+  <cs:trendline>
+    <cs:lnRef idx="0">
+      <cs:styleClr val="auto"/>
+    </cs:lnRef>
+    <cs:fillRef idx="0"/>
+    <cs:effectRef idx="0"/>
+    <cs:fontRef idx="minor">
+      <a:schemeClr val="tx1"/>
+    </cs:fontRef>
+    <cs:spPr>
+      <a:ln w="19050" cap="rnd">
+        <a:solidFill>
+          <a:schemeClr val="phClr"/>
+        </a:solidFill>
+        <a:prstDash val="sysDot"/>
+      </a:ln>
+    </cs:spPr>
+  </cs:trendline>
+  <cs:trendlineLabel>
+    <cs:lnRef idx="0"/>
+    <cs:fillRef idx="0"/>
+    <cs:effectRef idx="0"/>
+    <cs:fontRef idx="minor">
+      <a:schemeClr val="tx1">
+        <a:lumMod val="65000"/>
+        <a:lumOff val="35000"/>
+      </a:schemeClr>
+    </cs:fontRef>
+    <cs:defRPr sz="900" kern="1200"/>
+  </cs:trendlineLabel>
+  <cs:upBar>
+    <cs:lnRef idx="0"/>
+    <cs:fillRef idx="0"/>
+    <cs:effectRef idx="0"/>
+    <cs:fontRef idx="minor">
+      <a:schemeClr val="dk1"/>
+    </cs:fontRef>
+    <cs:spPr>
+      <a:solidFill>
+        <a:schemeClr val="lt1"/>
+      </a:solidFill>
+      <a:ln w="9525">
+        <a:solidFill>
+          <a:schemeClr val="tx1">
+            <a:lumMod val="15000"/>
+            <a:lumOff val="85000"/>
+          </a:schemeClr>
+        </a:solidFill>
+      </a:ln>
+    </cs:spPr>
+  </cs:upBar>
+  <cs:valueAxis>
+    <cs:lnRef idx="0"/>
+    <cs:fillRef idx="0"/>
+    <cs:effectRef idx="0"/>
+    <cs:fontRef idx="minor">
+      <a:schemeClr val="tx1">
+        <a:lumMod val="65000"/>
+        <a:lumOff val="35000"/>
+      </a:schemeClr>
+    </cs:fontRef>
+    <cs:defRPr sz="900" kern="1200"/>
+  </cs:valueAxis>
+  <cs:wall>
+    <cs:lnRef idx="0"/>
+    <cs:fillRef idx="0"/>
+    <cs:effectRef idx="0"/>
+    <cs:fontRef idx="minor">
+      <a:schemeClr val="tx1"/>
+    </cs:fontRef>
+    <cs:spPr>
+      <a:noFill/>
+      <a:ln>
+        <a:noFill/>
+      </a:ln>
+    </cs:spPr>
+  </cs:wall>
+</cs:chartStyle>
+</file>
+
+<file path=word/charts/style3.xml><?xml version="1.0" encoding="utf-8"?>
+<cs:chartStyle xmlns:cs="http://schemas.microsoft.com/office/drawing/2012/chartStyle" xmlns:a="http://schemas.openxmlformats.org/drawingml/2006/main" id="201">
+  <cs:axisTitle>
+    <cs:lnRef idx="0"/>
+    <cs:fillRef idx="0"/>
+    <cs:effectRef idx="0"/>
+    <cs:fontRef idx="minor">
+      <a:schemeClr val="tx1">
+        <a:lumMod val="65000"/>
+        <a:lumOff val="35000"/>
+      </a:schemeClr>
+    </cs:fontRef>
+    <cs:defRPr sz="1000" kern="1200"/>
+  </cs:axisTitle>
+  <cs:categoryAxis>
+    <cs:lnRef idx="0"/>
+    <cs:fillRef idx="0"/>
+    <cs:effectRef idx="0"/>
+    <cs:fontRef idx="minor">
+      <a:schemeClr val="tx1">
+        <a:lumMod val="65000"/>
+        <a:lumOff val="35000"/>
+      </a:schemeClr>
+    </cs:fontRef>
+    <cs:spPr>
+      <a:ln w="9525" cap="flat" cmpd="sng" algn="ctr">
+        <a:solidFill>
+          <a:schemeClr val="tx1">
+            <a:lumMod val="15000"/>
+            <a:lumOff val="85000"/>
+          </a:schemeClr>
+        </a:solidFill>
+        <a:round/>
+      </a:ln>
+    </cs:spPr>
+    <cs:defRPr sz="900" kern="1200"/>
+  </cs:categoryAxis>
+  <cs:chartArea mods="allowNoFillOverride allowNoLineOverride">
+    <cs:lnRef idx="0"/>
+    <cs:fillRef idx="0"/>
+    <cs:effectRef idx="0"/>
+    <cs:fontRef idx="minor">
+      <a:schemeClr val="tx1"/>
+    </cs:fontRef>
+    <cs:spPr>
+      <a:solidFill>
+        <a:schemeClr val="bg1"/>
+      </a:solidFill>
+      <a:ln w="9525" cap="flat" cmpd="sng" algn="ctr">
+        <a:solidFill>
+          <a:schemeClr val="tx1">
+            <a:lumMod val="15000"/>
+            <a:lumOff val="85000"/>
+          </a:schemeClr>
+        </a:solidFill>
+        <a:round/>
+      </a:ln>
+    </cs:spPr>
+    <cs:defRPr sz="1000" kern="1200"/>
+  </cs:chartArea>
+  <cs:dataLabel>
+    <cs:lnRef idx="0"/>
+    <cs:fillRef idx="0"/>
+    <cs:effectRef idx="0"/>
+    <cs:fontRef idx="minor">
+      <a:schemeClr val="tx1">
+        <a:lumMod val="75000"/>
+        <a:lumOff val="25000"/>
+      </a:schemeClr>
+    </cs:fontRef>
+    <cs:defRPr sz="900" kern="1200"/>
+  </cs:dataLabel>
+  <cs:dataLabelCallout>
+    <cs:lnRef idx="0"/>
+    <cs:fillRef idx="0"/>
+    <cs:effectRef idx="0"/>
+    <cs:fontRef idx="minor">
+      <a:schemeClr val="dk1">
+        <a:lumMod val="65000"/>
+        <a:lumOff val="35000"/>
+      </a:schemeClr>
+    </cs:fontRef>
+    <cs:spPr>
+      <a:solidFill>
+        <a:schemeClr val="lt1"/>
+      </a:solidFill>
+      <a:ln>
+        <a:solidFill>
+          <a:schemeClr val="dk1">
+            <a:lumMod val="25000"/>
+            <a:lumOff val="75000"/>
+          </a:schemeClr>
+        </a:solidFill>
+      </a:ln>
+    </cs:spPr>
+    <cs:defRPr sz="900" kern="1200"/>
+    <cs:bodyPr rot="0" spcFirstLastPara="1" vertOverflow="clip" horzOverflow="clip" vert="horz" wrap="square" lIns="36576" tIns="18288" rIns="36576" bIns="18288" anchor="ctr" anchorCtr="1">
+      <a:spAutoFit/>
+    </cs:bodyPr>
+  </cs:dataLabelCallout>
+  <cs:dataPoint>
+    <cs:lnRef idx="0"/>
+    <cs:fillRef idx="1">
+      <cs:styleClr val="auto"/>
+    </cs:fillRef>
+    <cs:effectRef idx="0"/>
+    <cs:fontRef idx="minor">
+      <a:schemeClr val="tx1"/>
+    </cs:fontRef>
+  </cs:dataPoint>
+  <cs:dataPoint3D>
+    <cs:lnRef idx="0"/>
+    <cs:fillRef idx="1">
+      <cs:styleClr val="auto"/>
+    </cs:fillRef>
+    <cs:effectRef idx="0"/>
+    <cs:fontRef idx="minor">
+      <a:schemeClr val="tx1"/>
+    </cs:fontRef>
+  </cs:dataPoint3D>
+  <cs:dataPointLine>
+    <cs:lnRef idx="0">
+      <cs:styleClr val="auto"/>
+    </cs:lnRef>
+    <cs:fillRef idx="1"/>
+    <cs:effectRef idx="0"/>
+    <cs:fontRef idx="minor">
+      <a:schemeClr val="tx1"/>
+    </cs:fontRef>
+    <cs:spPr>
+      <a:ln w="28575" cap="rnd">
+        <a:solidFill>
+          <a:schemeClr val="phClr"/>
+        </a:solidFill>
+        <a:round/>
+      </a:ln>
+    </cs:spPr>
+  </cs:dataPointLine>
+  <cs:dataPointMarker>
+    <cs:lnRef idx="0">
+      <cs:styleClr val="auto"/>
+    </cs:lnRef>
+    <cs:fillRef idx="1">
+      <cs:styleClr val="auto"/>
+    </cs:fillRef>
+    <cs:effectRef idx="0"/>
+    <cs:fontRef idx="minor">
+      <a:schemeClr val="tx1"/>
+    </cs:fontRef>
+    <cs:spPr>
+      <a:ln w="9525">
+        <a:solidFill>
+          <a:schemeClr val="phClr"/>
+        </a:solidFill>
+      </a:ln>
+    </cs:spPr>
+  </cs:dataPointMarker>
+  <cs:dataPointMarkerLayout symbol="circle" size="5"/>
+  <cs:dataPointWireframe>
+    <cs:lnRef idx="0">
+      <cs:styleClr val="auto"/>
+    </cs:lnRef>
+    <cs:fillRef idx="1"/>
+    <cs:effectRef idx="0"/>
+    <cs:fontRef idx="minor">
+      <a:schemeClr val="tx1"/>
+    </cs:fontRef>
+    <cs:spPr>
+      <a:ln w="9525" cap="rnd">
+        <a:solidFill>
+          <a:schemeClr val="phClr"/>
+        </a:solidFill>
+        <a:round/>
+      </a:ln>
+    </cs:spPr>
+  </cs:dataPointWireframe>
+  <cs:dataTable>
+    <cs:lnRef idx="0"/>
+    <cs:fillRef idx="0"/>
+    <cs:effectRef idx="0"/>
+    <cs:fontRef idx="minor">
+      <a:schemeClr val="tx1">
+        <a:lumMod val="65000"/>
+        <a:lumOff val="35000"/>
+      </a:schemeClr>
+    </cs:fontRef>
+    <cs:spPr>
+      <a:noFill/>
+      <a:ln w="9525" cap="flat" cmpd="sng" algn="ctr">
+        <a:solidFill>
+          <a:schemeClr val="tx1">
+            <a:lumMod val="15000"/>
+            <a:lumOff val="85000"/>
+          </a:schemeClr>
+        </a:solidFill>
+        <a:round/>
+      </a:ln>
+    </cs:spPr>
+    <cs:defRPr sz="900" kern="1200"/>
+  </cs:dataTable>
+  <cs:downBar>
+    <cs:lnRef idx="0"/>
+    <cs:fillRef idx="0"/>
+    <cs:effectRef idx="0"/>
+    <cs:fontRef idx="minor">
+      <a:schemeClr val="dk1"/>
+    </cs:fontRef>
+    <cs:spPr>
+      <a:solidFill>
+        <a:schemeClr val="dk1">
+          <a:lumMod val="65000"/>
+          <a:lumOff val="35000"/>
+        </a:schemeClr>
+      </a:solidFill>
+      <a:ln w="9525">
+        <a:solidFill>
+          <a:schemeClr val="tx1">
+            <a:lumMod val="65000"/>
+            <a:lumOff val="35000"/>
+          </a:schemeClr>
+        </a:solidFill>
+      </a:ln>
+    </cs:spPr>
+  </cs:downBar>
+  <cs:dropLine>
+    <cs:lnRef idx="0"/>
+    <cs:fillRef idx="0"/>
+    <cs:effectRef idx="0"/>
+    <cs:fontRef idx="minor">
+      <a:schemeClr val="tx1"/>
+    </cs:fontRef>
+    <cs:spPr>
+      <a:ln w="9525" cap="flat" cmpd="sng" algn="ctr">
+        <a:solidFill>
+          <a:schemeClr val="tx1">
+            <a:lumMod val="35000"/>
+            <a:lumOff val="65000"/>
+          </a:schemeClr>
+        </a:solidFill>
+        <a:round/>
+      </a:ln>
+    </cs:spPr>
+  </cs:dropLine>
+  <cs:errorBar>
+    <cs:lnRef idx="0"/>
+    <cs:fillRef idx="0"/>
+    <cs:effectRef idx="0"/>
+    <cs:fontRef idx="minor">
+      <a:schemeClr val="tx1"/>
+    </cs:fontRef>
+    <cs:spPr>
+      <a:ln w="9525" cap="flat" cmpd="sng" algn="ctr">
+        <a:solidFill>
+          <a:schemeClr val="tx1">
+            <a:lumMod val="65000"/>
+            <a:lumOff val="35000"/>
+          </a:schemeClr>
+        </a:solidFill>
+        <a:round/>
+      </a:ln>
+    </cs:spPr>
+  </cs:errorBar>
+  <cs:floor>
+    <cs:lnRef idx="0"/>
+    <cs:fillRef idx="0"/>
+    <cs:effectRef idx="0"/>
+    <cs:fontRef idx="minor">
+      <a:schemeClr val="tx1"/>
+    </cs:fontRef>
+    <cs:spPr>
+      <a:noFill/>
+      <a:ln>
+        <a:noFill/>
+      </a:ln>
+    </cs:spPr>
+  </cs:floor>
+  <cs:gridlineMajor>
+    <cs:lnRef idx="0"/>
+    <cs:fillRef idx="0"/>
+    <cs:effectRef idx="0"/>
+    <cs:fontRef idx="minor">
+      <a:schemeClr val="tx1"/>
+    </cs:fontRef>
+    <cs:spPr>
+      <a:ln w="9525" cap="flat" cmpd="sng" algn="ctr">
+        <a:solidFill>
+          <a:schemeClr val="tx1">
+            <a:lumMod val="15000"/>
+            <a:lumOff val="85000"/>
+          </a:schemeClr>
+        </a:solidFill>
+        <a:round/>
+      </a:ln>
+    </cs:spPr>
+  </cs:gridlineMajor>
+  <cs:gridlineMinor>
+    <cs:lnRef idx="0"/>
+    <cs:fillRef idx="0"/>
+    <cs:effectRef idx="0"/>
+    <cs:fontRef idx="minor">
+      <a:schemeClr val="tx1"/>
+    </cs:fontRef>
+    <cs:spPr>
+      <a:ln w="9525" cap="flat" cmpd="sng" algn="ctr">
+        <a:solidFill>
+          <a:schemeClr val="tx1">
+            <a:lumMod val="5000"/>
+            <a:lumOff val="95000"/>
+          </a:schemeClr>
+        </a:solidFill>
+        <a:round/>
+      </a:ln>
+    </cs:spPr>
+  </cs:gridlineMinor>
+  <cs:hiLoLine>
+    <cs:lnRef idx="0"/>
+    <cs:fillRef idx="0"/>
+    <cs:effectRef idx="0"/>
+    <cs:fontRef idx="minor">
+      <a:schemeClr val="tx1"/>
+    </cs:fontRef>
+    <cs:spPr>
+      <a:ln w="9525" cap="flat" cmpd="sng" algn="ctr">
+        <a:solidFill>
+          <a:schemeClr val="tx1">
+            <a:lumMod val="75000"/>
+            <a:lumOff val="25000"/>
+          </a:schemeClr>
+        </a:solidFill>
+        <a:round/>
+      </a:ln>
+    </cs:spPr>
+  </cs:hiLoLine>
+  <cs:leaderLine>
+    <cs:lnRef idx="0"/>
+    <cs:fillRef idx="0"/>
+    <cs:effectRef idx="0"/>
+    <cs:fontRef idx="minor">
+      <a:schemeClr val="tx1"/>
+    </cs:fontRef>
+    <cs:spPr>
+      <a:ln w="9525" cap="flat" cmpd="sng" algn="ctr">
+        <a:solidFill>
+          <a:schemeClr val="tx1">
+            <a:lumMod val="35000"/>
+            <a:lumOff val="65000"/>
+          </a:schemeClr>
+        </a:solidFill>
+        <a:round/>
+      </a:ln>
+    </cs:spPr>
+  </cs:leaderLine>
+  <cs:legend>
+    <cs:lnRef idx="0"/>
+    <cs:fillRef idx="0"/>
+    <cs:effectRef idx="0"/>
+    <cs:fontRef idx="minor">
+      <a:schemeClr val="tx1">
+        <a:lumMod val="65000"/>
+        <a:lumOff val="35000"/>
+      </a:schemeClr>
+    </cs:fontRef>
+    <cs:defRPr sz="900" kern="1200"/>
+  </cs:legend>
+  <cs:plotArea mods="allowNoFillOverride allowNoLineOverride">
+    <cs:lnRef idx="0"/>
+    <cs:fillRef idx="0"/>
+    <cs:effectRef idx="0"/>
+    <cs:fontRef idx="minor">
+      <a:schemeClr val="tx1"/>
+    </cs:fontRef>
+  </cs:plotArea>
+  <cs:plotArea3D mods="allowNoFillOverride allowNoLineOverride">
+    <cs:lnRef idx="0"/>
+    <cs:fillRef idx="0"/>
+    <cs:effectRef idx="0"/>
+    <cs:fontRef idx="minor">
+      <a:schemeClr val="tx1"/>
+    </cs:fontRef>
+  </cs:plotArea3D>
+  <cs:seriesAxis>
+    <cs:lnRef idx="0"/>
+    <cs:fillRef idx="0"/>
+    <cs:effectRef idx="0"/>
+    <cs:fontRef idx="minor">
+      <a:schemeClr val="tx1">
+        <a:lumMod val="65000"/>
+        <a:lumOff val="35000"/>
+      </a:schemeClr>
+    </cs:fontRef>
+    <cs:defRPr sz="900" kern="1200"/>
+  </cs:seriesAxis>
+  <cs:seriesLine>
+    <cs:lnRef idx="0"/>
+    <cs:fillRef idx="0"/>
+    <cs:effectRef idx="0"/>
+    <cs:fontRef idx="minor">
+      <a:schemeClr val="tx1"/>
+    </cs:fontRef>
+    <cs:spPr>
+      <a:ln w="9525" cap="flat" cmpd="sng" algn="ctr">
+        <a:solidFill>
+          <a:schemeClr val="tx1">
+            <a:lumMod val="35000"/>
+            <a:lumOff val="65000"/>
+          </a:schemeClr>
+        </a:solidFill>
+        <a:round/>
+      </a:ln>
+    </cs:spPr>
+  </cs:seriesLine>
+  <cs:title>
+    <cs:lnRef idx="0"/>
+    <cs:fillRef idx="0"/>
+    <cs:effectRef idx="0"/>
+    <cs:fontRef idx="minor">
+      <a:schemeClr val="tx1">
+        <a:lumMod val="65000"/>
+        <a:lumOff val="35000"/>
+      </a:schemeClr>
+    </cs:fontRef>
+    <cs:defRPr sz="1400" b="0" kern="1200" spc="0" baseline="0"/>
+  </cs:title>
+  <cs:trendline>
+    <cs:lnRef idx="0">
+      <cs:styleClr val="auto"/>
+    </cs:lnRef>
+    <cs:fillRef idx="0"/>
+    <cs:effectRef idx="0"/>
+    <cs:fontRef idx="minor">
+      <a:schemeClr val="tx1"/>
+    </cs:fontRef>
+    <cs:spPr>
+      <a:ln w="19050" cap="rnd">
+        <a:solidFill>
+          <a:schemeClr val="phClr"/>
+        </a:solidFill>
+        <a:prstDash val="sysDot"/>
+      </a:ln>
+    </cs:spPr>
+  </cs:trendline>
+  <cs:trendlineLabel>
+    <cs:lnRef idx="0"/>
+    <cs:fillRef idx="0"/>
+    <cs:effectRef idx="0"/>
+    <cs:fontRef idx="minor">
+      <a:schemeClr val="tx1">
+        <a:lumMod val="65000"/>
+        <a:lumOff val="35000"/>
+      </a:schemeClr>
+    </cs:fontRef>
+    <cs:defRPr sz="900" kern="1200"/>
+  </cs:trendlineLabel>
+  <cs:upBar>
+    <cs:lnRef idx="0"/>
+    <cs:fillRef idx="0"/>
+    <cs:effectRef idx="0"/>
+    <cs:fontRef idx="minor">
+      <a:schemeClr val="dk1"/>
+    </cs:fontRef>
+    <cs:spPr>
+      <a:solidFill>
+        <a:schemeClr val="lt1"/>
+      </a:solidFill>
+      <a:ln w="9525">
+        <a:solidFill>
+          <a:schemeClr val="tx1">
+            <a:lumMod val="15000"/>
+            <a:lumOff val="85000"/>
+          </a:schemeClr>
+        </a:solidFill>
+      </a:ln>
+    </cs:spPr>
+  </cs:upBar>
+  <cs:valueAxis>
+    <cs:lnRef idx="0"/>
+    <cs:fillRef idx="0"/>
+    <cs:effectRef idx="0"/>
+    <cs:fontRef idx="minor">
+      <a:schemeClr val="tx1">
+        <a:lumMod val="65000"/>
+        <a:lumOff val="35000"/>
+      </a:schemeClr>
+    </cs:fontRef>
+    <cs:defRPr sz="900" kern="1200"/>
+  </cs:valueAxis>
+  <cs:wall>
+    <cs:lnRef idx="0"/>
+    <cs:fillRef idx="0"/>
+    <cs:effectRef idx="0"/>
+    <cs:fontRef idx="minor">
+      <a:schemeClr val="tx1"/>
+    </cs:fontRef>
+    <cs:spPr>
+      <a:noFill/>
+      <a:ln>
+        <a:noFill/>
+      </a:ln>
+    </cs:spPr>
+  </cs:wall>
+</cs:chartStyle>
+</file>
+
 <file path=word/theme/theme1.xml><?xml version="1.0" encoding="utf-8"?>
 <a:theme xmlns:a="http://schemas.openxmlformats.org/drawingml/2006/main" name="Office Theme">
   <a:themeElements>

</xml_diff>